<commit_message>
Add literature review PDF, AI report and similarity report
</commit_message>
<xml_diff>
--- a/report/DemandIQ_Project_Report.docx
+++ b/report/DemandIQ_Project_Report.docx
@@ -107,7 +107,6 @@
         <w:spacing w:after="40"/>
         <w:jc w:val="center"/>
       </w:pPr>
-      <w:proofErr w:type="spellStart"/>
       <w:r>
         <w:rPr>
           <w:b/>
@@ -115,7 +114,6 @@
         </w:rPr>
         <w:t>DemandIQ</w:t>
       </w:r>
-      <w:proofErr w:type="spellEnd"/>
     </w:p>
     <w:p>
       <w:pPr>
@@ -144,13 +142,9 @@
         <w:spacing w:after="440"/>
         <w:jc w:val="center"/>
       </w:pPr>
-      <w:proofErr w:type="spellStart"/>
-      <w:proofErr w:type="gramStart"/>
       <w:r>
         <w:t>B.Tech</w:t>
       </w:r>
-      <w:proofErr w:type="spellEnd"/>
-      <w:proofErr w:type="gramEnd"/>
       <w:r>
         <w:t xml:space="preserve"> </w:t>
       </w:r>
@@ -477,37 +471,13 @@
         <w:jc w:val="both"/>
       </w:pPr>
       <w:r>
-        <w:t xml:space="preserve">We, the undersigned students of </w:t>
-      </w:r>
-      <w:proofErr w:type="spellStart"/>
-      <w:proofErr w:type="gramStart"/>
-      <w:r>
-        <w:t>B.Tech</w:t>
-      </w:r>
-      <w:proofErr w:type="spellEnd"/>
-      <w:proofErr w:type="gramEnd"/>
-      <w:r>
-        <w:t xml:space="preserve"> Semester V, Mukesh Patel School of Technology Management &amp; Engineering, SVKM's NMIMS, Mumbai, declare that this report titled </w:t>
+        <w:t xml:space="preserve">We, the undersigned students of B.Tech Semester V, Mukesh Patel School of Technology Management &amp; Engineering, SVKM's NMIMS, Mumbai, declare that this report titled </w:t>
       </w:r>
       <w:r>
         <w:rPr>
           <w:b/>
         </w:rPr>
-        <w:t>"</w:t>
-      </w:r>
-      <w:proofErr w:type="spellStart"/>
-      <w:r>
-        <w:rPr>
-          <w:b/>
-        </w:rPr>
-        <w:t>DemandIQ</w:t>
-      </w:r>
-      <w:proofErr w:type="spellEnd"/>
-      <w:r>
-        <w:rPr>
-          <w:b/>
-        </w:rPr>
-        <w:t>: Machine Learning for Product Demand and Stockout Risk Prediction"</w:t>
+        <w:t>"DemandIQ: Machine Learning for Product Demand and Stockout Risk Prediction"</w:t>
       </w:r>
       <w:r>
         <w:t xml:space="preserve"> is a record of the work carried out by us as part of the Machine Learning group activity during the academic year 2026-27. The data used is publicly available, all sources of information have been acknowledged in the References section, and the code and results presented here were produced by our team.</w:t>
@@ -1032,7 +1002,7 @@
               <w:rPr>
                 <w:sz w:val="20"/>
               </w:rPr>
-              <w:t>Problem framing and objectives; literature survey (20 books, 15 papers); research gaps; report writing and formatting; project coordination</w:t>
+              <w:t>Introduction and problem statement; objectives; literature survey (20 books, 15 research papers); research gaps; report writing and formatting; project coordination</w:t>
             </w:r>
           </w:p>
         </w:tc>
@@ -1089,7 +1059,7 @@
               <w:rPr>
                 <w:sz w:val="20"/>
               </w:rPr>
-              <w:t>Demand forecasting models (baselines, Ridge, Random Forest, Gradient Boosting); hyper-parameter tuning; quantile models; model evaluation</w:t>
+              <w:t>Stockout-risk classifier and results; SHAP explainability; Streamlit dashboard and what-if simulator; limitations, conclusion and future scope</w:t>
             </w:r>
           </w:p>
         </w:tc>
@@ -1146,7 +1116,7 @@
               <w:rPr>
                 <w:sz w:val="20"/>
               </w:rPr>
-              <w:t>Data cleaning and merging; feature engineering; K-Means store segmentation; inventory simulation (digital twin); reorder-policy comparison</w:t>
+              <w:t>System design and architecture; K-Means store segmentation; inventory simulation (digital twin); ordering policies and fair trade-off comparison</w:t>
             </w:r>
           </w:p>
         </w:tc>
@@ -1200,21 +1170,7 @@
               <w:rPr>
                 <w:sz w:val="20"/>
               </w:rPr>
-              <w:t xml:space="preserve">Stockout-risk classifier; SHAP explainability; </w:t>
-            </w:r>
-            <w:proofErr w:type="spellStart"/>
-            <w:r>
-              <w:rPr>
-                <w:sz w:val="20"/>
-              </w:rPr>
-              <w:t>Streamlit</w:t>
-            </w:r>
-            <w:proofErr w:type="spellEnd"/>
-            <w:r>
-              <w:rPr>
-                <w:sz w:val="20"/>
-              </w:rPr>
-              <w:t xml:space="preserve"> dashboard and what-if simulator; figures and presentation</w:t>
+              <w:t>Dataset selection and preparation; exploratory data analysis; demand forecasting models (baselines, Ridge, Random Forest, Gradient Boosting); model comparison; hyper-parameter tuning and quantile models</w:t>
             </w:r>
           </w:p>
         </w:tc>
@@ -9024,40 +8980,14 @@
       <w:r>
         <w:t xml:space="preserve">Retailers lose money in two ways: when a shelf runs empty the sale is lost, and when too much stock is held, cash is tied up and goods age on the shelf. Both problems come from not knowing tomorrow's demand. This project builds </w:t>
       </w:r>
-      <w:proofErr w:type="spellStart"/>
       <w:r>
         <w:rPr>
           <w:b/>
         </w:rPr>
         <w:t>DemandIQ</w:t>
       </w:r>
-      <w:proofErr w:type="spellEnd"/>
-      <w:r>
-        <w:t xml:space="preserve">, a classical machine-learning system (no deep learning) that forecasts daily demand, predicts the probability of a stockout in the next three days, recommends how much to reorder, and explains every prediction. We use the public Rossmann Store Sales dataset (1,017,209 store-days, 1,115 German drugstores, 2013-2015), keep the 935 stores with a complete history, and split the data strictly by time. K-Means groups the stores into four </w:t>
-      </w:r>
-      <w:proofErr w:type="spellStart"/>
-      <w:r>
-        <w:t>behavioural</w:t>
-      </w:r>
-      <w:proofErr w:type="spellEnd"/>
-      <w:r>
-        <w:t xml:space="preserve"> segments. For demand, a tuned Gradient Boosting regressor reaches a test MAPE of 7.96% and R² of 0.941, against 10.22% for a store-weekday-promotion average baseline. Because Rossmann does not publish stock levels, we replay a realistic ordering process over the real sales, calibrated to the 8.3% worldwide out-of-stock rate, to obtain stock and stockout labels. A Gradient Boosting classifier predicts three-day stockout risk with ROC-AUC 0.873. On the held-out June-July 2015 window, ordering with </w:t>
-      </w:r>
-      <w:proofErr w:type="spellStart"/>
-      <w:r>
-        <w:t>DemandIQ's</w:t>
-      </w:r>
-      <w:proofErr w:type="spellEnd"/>
-      <w:r>
-        <w:t xml:space="preserve"> forecast and risk alerts cuts stockout days from 7.51% to 1.50% and total inventory cost by 63% compared with a manager's rule of thumb. SHAP explanations and a </w:t>
-      </w:r>
-      <w:proofErr w:type="spellStart"/>
-      <w:r>
-        <w:t>Streamlit</w:t>
-      </w:r>
-      <w:proofErr w:type="spellEnd"/>
-      <w:r>
-        <w:t xml:space="preserve"> what-if dashboard make each number traceable. The main lesson is that a forecast creates value only when it is turned into an explained ordering decision.</w:t>
+      <w:r>
+        <w:t>, a classical machine-learning system (no deep learning) that forecasts daily demand, predicts the probability of a stockout in the next three days, recommends how much to reorder, and explains every prediction. We use the public Rossmann Store Sales dataset (1,017,209 store-days, 1,115 German drugstores, 2013-2015), keep the 935 stores with a complete history, and split the data strictly by time. K-Means groups the stores into four behavioural segments. For demand, a tuned Gradient Boosting regressor reaches a test MAPE of 7.96% and R² of 0.941, against 10.22% for a store-weekday-promotion average baseline. Because Rossmann does not publish stock levels, we replay a realistic ordering process over the real sales, calibrated to the 8.3% worldwide out-of-stock rate, to obtain stock and stockout labels. A Gradient Boosting classifier predicts three-day stockout risk with ROC-AUC 0.873. On the held-out June-July 2015 window, ordering with DemandIQ's forecast and risk alerts cuts stockout days from 7.51% to 1.50% and total inventory cost by 63% compared with a manager's rule of thumb. SHAP explanations and a Streamlit what-if dashboard make each number traceable. The main lesson is that a forecast creates value only when it is turned into an explained ordering decision.</w:t>
       </w:r>
     </w:p>
     <w:p>
@@ -9068,15 +8998,7 @@
         <w:t>Keywords:</w:t>
       </w:r>
       <w:r>
-        <w:t xml:space="preserve"> demand forecasting, stockout prediction, gradient boosting, random forest, K-Means, SHAP, inventory </w:t>
-      </w:r>
-      <w:proofErr w:type="spellStart"/>
-      <w:r>
-        <w:t>optimisation</w:t>
-      </w:r>
-      <w:proofErr w:type="spellEnd"/>
-      <w:r>
-        <w:t>, explainable machine learning.</w:t>
+        <w:t xml:space="preserve"> demand forecasting, stockout prediction, gradient boosting, random forest, K-Means, SHAP, inventory optimisation, explainable machine learning.</w:t>
       </w:r>
     </w:p>
     <w:p>
@@ -9216,21 +9138,7 @@
         <w:rPr>
           <w:color w:val="auto"/>
         </w:rPr>
-        <w:t xml:space="preserve">Where </w:t>
-      </w:r>
-      <w:proofErr w:type="spellStart"/>
-      <w:r>
-        <w:rPr>
-          <w:color w:val="auto"/>
-        </w:rPr>
-        <w:t>DemandIQ</w:t>
-      </w:r>
-      <w:proofErr w:type="spellEnd"/>
-      <w:r>
-        <w:rPr>
-          <w:color w:val="auto"/>
-        </w:rPr>
-        <w:t xml:space="preserve"> applies</w:t>
+        <w:t>Where DemandIQ applies</w:t>
       </w:r>
       <w:bookmarkEnd w:id="11"/>
     </w:p>
@@ -9283,23 +9191,7 @@
                 <w:b/>
                 <w:sz w:val="20"/>
               </w:rPr>
-              <w:t xml:space="preserve">How </w:t>
-            </w:r>
-            <w:proofErr w:type="spellStart"/>
-            <w:r>
-              <w:rPr>
-                <w:b/>
-                <w:sz w:val="20"/>
-              </w:rPr>
-              <w:t>DemandIQ</w:t>
-            </w:r>
-            <w:proofErr w:type="spellEnd"/>
-            <w:r>
-              <w:rPr>
-                <w:b/>
-                <w:sz w:val="20"/>
-              </w:rPr>
-              <w:t xml:space="preserve"> helps</w:t>
+              <w:t>How DemandIQ helps</w:t>
             </w:r>
           </w:p>
         </w:tc>
@@ -9744,17 +9636,9 @@
         <w:rPr>
           <w:color w:val="auto"/>
         </w:rPr>
-        <w:t xml:space="preserve">Reference books consulted and what each contributed to </w:t>
-      </w:r>
-      <w:proofErr w:type="spellStart"/>
-      <w:r>
-        <w:rPr>
-          <w:color w:val="auto"/>
-        </w:rPr>
-        <w:t>DemandIQ</w:t>
+        <w:t>Reference books consulted and what each contributed to DemandIQ</w:t>
       </w:r>
       <w:bookmarkEnd w:id="16"/>
-      <w:proofErr w:type="spellEnd"/>
     </w:p>
     <w:tbl>
       <w:tblPr>
@@ -10234,19 +10118,11 @@
             <w:pPr>
               <w:spacing w:after="0"/>
             </w:pPr>
-            <w:proofErr w:type="spellStart"/>
             <w:r>
               <w:rPr>
                 <w:sz w:val="18"/>
               </w:rPr>
-              <w:t>Axsäter</w:t>
-            </w:r>
-            <w:proofErr w:type="spellEnd"/>
-            <w:r>
-              <w:rPr>
-                <w:sz w:val="18"/>
-              </w:rPr>
-              <w:t>, Inventory Control (2015)</w:t>
+              <w:t>Axsäter, Inventory Control (2015)</w:t>
             </w:r>
           </w:p>
         </w:tc>
@@ -10354,21 +10230,7 @@
               <w:rPr>
                 <w:sz w:val="18"/>
               </w:rPr>
-              <w:t xml:space="preserve">Hastie, </w:t>
-            </w:r>
-            <w:proofErr w:type="spellStart"/>
-            <w:r>
-              <w:rPr>
-                <w:sz w:val="18"/>
-              </w:rPr>
-              <w:t>Tibshirani</w:t>
-            </w:r>
-            <w:proofErr w:type="spellEnd"/>
-            <w:r>
-              <w:rPr>
-                <w:sz w:val="18"/>
-              </w:rPr>
-              <w:t xml:space="preserve"> &amp; Friedman, Elements of Statistical Learning (2009)</w:t>
+              <w:t>Hastie, Tibshirani &amp; Friedman, Elements of Statistical Learning (2009)</w:t>
             </w:r>
           </w:p>
         </w:tc>
@@ -10422,21 +10284,7 @@
               <w:rPr>
                 <w:sz w:val="18"/>
               </w:rPr>
-              <w:t xml:space="preserve">James, Witten, Hastie &amp; </w:t>
-            </w:r>
-            <w:proofErr w:type="spellStart"/>
-            <w:r>
-              <w:rPr>
-                <w:sz w:val="18"/>
-              </w:rPr>
-              <w:t>Tibshirani</w:t>
-            </w:r>
-            <w:proofErr w:type="spellEnd"/>
-            <w:r>
-              <w:rPr>
-                <w:sz w:val="18"/>
-              </w:rPr>
-              <w:t>, Intro. to Statistical Learning (2021)</w:t>
+              <w:t>James, Witten, Hastie &amp; Tibshirani, Intro. to Statistical Learning (2021)</w:t>
             </w:r>
           </w:p>
         </w:tc>
@@ -10594,19 +10442,11 @@
             <w:pPr>
               <w:spacing w:after="0"/>
             </w:pPr>
-            <w:proofErr w:type="spellStart"/>
             <w:r>
               <w:rPr>
                 <w:sz w:val="18"/>
               </w:rPr>
-              <w:t>Géron</w:t>
-            </w:r>
-            <w:proofErr w:type="spellEnd"/>
-            <w:r>
-              <w:rPr>
-                <w:sz w:val="18"/>
-              </w:rPr>
-              <w:t>, Hands-On Machine Learning (2022)</w:t>
+              <w:t>Géron, Hands-On Machine Learning (2022)</w:t>
             </w:r>
           </w:p>
         </w:tc>
@@ -10876,21 +10716,7 @@
               <w:rPr>
                 <w:sz w:val="18"/>
               </w:rPr>
-              <w:t xml:space="preserve">Pearl, </w:t>
-            </w:r>
-            <w:proofErr w:type="spellStart"/>
-            <w:r>
-              <w:rPr>
-                <w:sz w:val="18"/>
-              </w:rPr>
-              <w:t>Glymour</w:t>
-            </w:r>
-            <w:proofErr w:type="spellEnd"/>
-            <w:r>
-              <w:rPr>
-                <w:sz w:val="18"/>
-              </w:rPr>
-              <w:t xml:space="preserve"> &amp; Jewell, Causal Inference in Statistics (2016)</w:t>
+              <w:t>Pearl, Glymour &amp; Jewell, Causal Inference in Statistics (2016)</w:t>
             </w:r>
           </w:p>
         </w:tc>
@@ -11199,33 +11025,11 @@
             <w:pPr>
               <w:spacing w:after="0"/>
             </w:pPr>
-            <w:proofErr w:type="spellStart"/>
             <w:r>
               <w:rPr>
                 <w:sz w:val="17"/>
               </w:rPr>
-              <w:t>Seyedan</w:t>
-            </w:r>
-            <w:proofErr w:type="spellEnd"/>
-            <w:r>
-              <w:rPr>
-                <w:sz w:val="17"/>
-              </w:rPr>
-              <w:t xml:space="preserve"> &amp; </w:t>
-            </w:r>
-            <w:proofErr w:type="spellStart"/>
-            <w:r>
-              <w:rPr>
-                <w:sz w:val="17"/>
-              </w:rPr>
-              <w:t>Mafakheri</w:t>
-            </w:r>
-            <w:proofErr w:type="spellEnd"/>
-            <w:r>
-              <w:rPr>
-                <w:sz w:val="17"/>
-              </w:rPr>
-              <w:t>, 2020</w:t>
+              <w:t>Seyedan &amp; Mafakheri, 2020</w:t>
             </w:r>
           </w:p>
         </w:tc>
@@ -11323,49 +11127,27 @@
             <w:pPr>
               <w:spacing w:after="0"/>
             </w:pPr>
-            <w:proofErr w:type="spellStart"/>
             <w:r>
               <w:rPr>
                 <w:sz w:val="17"/>
               </w:rPr>
-              <w:t>Makridakis</w:t>
-            </w:r>
-            <w:proofErr w:type="spellEnd"/>
+              <w:t>Makridakis et al., 2022</w:t>
+            </w:r>
+          </w:p>
+        </w:tc>
+        <w:tc>
+          <w:tcPr>
+            <w:tcW w:w="1989" w:type="dxa"/>
+          </w:tcPr>
+          <w:p>
+            <w:pPr>
+              <w:spacing w:after="0"/>
+            </w:pPr>
             <w:r>
               <w:rPr>
                 <w:sz w:val="17"/>
               </w:rPr>
-              <w:t xml:space="preserve"> et al., 2022</w:t>
-            </w:r>
-          </w:p>
-        </w:tc>
-        <w:tc>
-          <w:tcPr>
-            <w:tcW w:w="1989" w:type="dxa"/>
-          </w:tcPr>
-          <w:p>
-            <w:pPr>
-              <w:spacing w:after="0"/>
-            </w:pPr>
-            <w:r>
-              <w:rPr>
-                <w:sz w:val="17"/>
-              </w:rPr>
-              <w:t xml:space="preserve">M5 competition; mostly </w:t>
-            </w:r>
-            <w:proofErr w:type="spellStart"/>
-            <w:r>
-              <w:rPr>
-                <w:sz w:val="17"/>
-              </w:rPr>
-              <w:t>LightGBM</w:t>
-            </w:r>
-            <w:proofErr w:type="spellEnd"/>
-            <w:r>
-              <w:rPr>
-                <w:sz w:val="17"/>
-              </w:rPr>
-              <w:t xml:space="preserve"> ensembles won</w:t>
+              <w:t>M5 competition; mostly LightGBM ensembles won</w:t>
             </w:r>
           </w:p>
         </w:tc>
@@ -11655,21 +11437,7 @@
               <w:rPr>
                 <w:sz w:val="17"/>
               </w:rPr>
-              <w:t xml:space="preserve">Huber &amp; </w:t>
-            </w:r>
-            <w:proofErr w:type="spellStart"/>
-            <w:r>
-              <w:rPr>
-                <w:sz w:val="17"/>
-              </w:rPr>
-              <w:t>Stuckenschmidt</w:t>
-            </w:r>
-            <w:proofErr w:type="spellEnd"/>
-            <w:r>
-              <w:rPr>
-                <w:sz w:val="17"/>
-              </w:rPr>
-              <w:t>, 2020</w:t>
+              <w:t>Huber &amp; Stuckenschmidt, 2020</w:t>
             </w:r>
           </w:p>
         </w:tc>
@@ -12195,62 +11963,40 @@
               <w:rPr>
                 <w:sz w:val="17"/>
               </w:rPr>
-              <w:t>Prescriptive analytics (</w:t>
-            </w:r>
-            <w:proofErr w:type="spellStart"/>
+              <w:t>Prescriptive analytics (kNN, trees, kernels)</w:t>
+            </w:r>
+          </w:p>
+        </w:tc>
+        <w:tc>
+          <w:tcPr>
+            <w:tcW w:w="1768" w:type="dxa"/>
+          </w:tcPr>
+          <w:p>
+            <w:pPr>
+              <w:spacing w:after="0"/>
+            </w:pPr>
             <w:r>
               <w:rPr>
                 <w:sz w:val="17"/>
               </w:rPr>
-              <w:t>kNN</w:t>
-            </w:r>
-            <w:proofErr w:type="spellEnd"/>
+              <w:t>Media distributor, ~1 bn units/yr</w:t>
+            </w:r>
+          </w:p>
+        </w:tc>
+        <w:tc>
+          <w:tcPr>
+            <w:tcW w:w="1989" w:type="dxa"/>
+          </w:tcPr>
+          <w:p>
+            <w:pPr>
+              <w:spacing w:after="0"/>
+            </w:pPr>
             <w:r>
               <w:rPr>
                 <w:sz w:val="17"/>
               </w:rPr>
-              <w:t>, trees, kernels)</w:t>
-            </w:r>
-          </w:p>
-        </w:tc>
-        <w:tc>
-          <w:tcPr>
-            <w:tcW w:w="1768" w:type="dxa"/>
-          </w:tcPr>
-          <w:p>
-            <w:pPr>
-              <w:spacing w:after="0"/>
-            </w:pPr>
-            <w:r>
-              <w:rPr>
-                <w:sz w:val="17"/>
-              </w:rPr>
-              <w:t>Media distributor, ~1 bn units/yr</w:t>
-            </w:r>
-          </w:p>
-        </w:tc>
-        <w:tc>
-          <w:tcPr>
-            <w:tcW w:w="1989" w:type="dxa"/>
-          </w:tcPr>
-          <w:p>
-            <w:pPr>
-              <w:spacing w:after="0"/>
-            </w:pPr>
-            <w:r>
-              <w:rPr>
-                <w:sz w:val="17"/>
-              </w:rPr>
-              <w:t>Data-driven decisions beat predict-then-</w:t>
-            </w:r>
-            <w:proofErr w:type="spellStart"/>
-            <w:r>
-              <w:rPr>
-                <w:sz w:val="17"/>
-              </w:rPr>
-              <w:t>optimise</w:t>
-            </w:r>
-            <w:proofErr w:type="spellEnd"/>
+              <w:t>Data-driven decisions beat predict-then-optimise</w:t>
+            </w:r>
           </w:p>
         </w:tc>
         <w:tc>
@@ -12519,19 +12265,11 @@
             <w:pPr>
               <w:spacing w:after="0"/>
             </w:pPr>
-            <w:proofErr w:type="spellStart"/>
             <w:r>
               <w:rPr>
                 <w:sz w:val="17"/>
               </w:rPr>
-              <w:t>LightGBM</w:t>
-            </w:r>
-            <w:proofErr w:type="spellEnd"/>
-            <w:r>
-              <w:rPr>
-                <w:sz w:val="17"/>
-              </w:rPr>
-              <w:t xml:space="preserve"> + PFI, PDP, SHAP, ICE</w:t>
+              <w:t>LightGBM + PFI, PDP, SHAP, ICE</w:t>
             </w:r>
           </w:p>
         </w:tc>
@@ -12613,19 +12351,11 @@
             <w:pPr>
               <w:spacing w:after="0"/>
             </w:pPr>
-            <w:proofErr w:type="spellStart"/>
             <w:r>
               <w:rPr>
                 <w:sz w:val="17"/>
               </w:rPr>
-              <w:t>Rožanec</w:t>
-            </w:r>
-            <w:proofErr w:type="spellEnd"/>
-            <w:r>
-              <w:rPr>
-                <w:sz w:val="17"/>
-              </w:rPr>
-              <w:t xml:space="preserve"> et al., 2022</w:t>
+              <w:t>Rožanec et al., 2022</w:t>
             </w:r>
           </w:p>
         </w:tc>
@@ -12723,19 +12453,11 @@
             <w:pPr>
               <w:spacing w:after="0"/>
             </w:pPr>
-            <w:proofErr w:type="spellStart"/>
             <w:r>
               <w:rPr>
                 <w:sz w:val="17"/>
               </w:rPr>
-              <w:t>Chernozhukov</w:t>
-            </w:r>
-            <w:proofErr w:type="spellEnd"/>
-            <w:r>
-              <w:rPr>
-                <w:sz w:val="17"/>
-              </w:rPr>
-              <w:t xml:space="preserve"> et al., 2018</w:t>
+              <w:t>Chernozhukov et al., 2018</w:t>
             </w:r>
           </w:p>
         </w:tc>
@@ -12837,23 +12559,7 @@
         <w:t>Machine learning forecasts retail demand well.</w:t>
       </w:r>
       <w:r>
-        <w:t xml:space="preserve"> Surveys show a clear move from classical time-series models to data-driven methods [25], [2]. In the M5 competition on Walmart data, machine-learning methods, most of them built on </w:t>
-      </w:r>
-      <w:proofErr w:type="spellStart"/>
-      <w:r>
-        <w:t>LightGBM</w:t>
-      </w:r>
-      <w:proofErr w:type="spellEnd"/>
-      <w:r>
-        <w:t xml:space="preserve">, beat the statistical benchmarks [3]. Gradient-boosted trees are the workhorse for this kind of tabular data and </w:t>
-      </w:r>
-      <w:proofErr w:type="spellStart"/>
-      <w:r>
-        <w:t>LightGBM</w:t>
-      </w:r>
-      <w:proofErr w:type="spellEnd"/>
-      <w:r>
-        <w:t xml:space="preserve"> trains much faster than older boosting at similar accuracy [26]. Three findings shaped our features: promotions need explicit features [27], calendar special days behave differently from normal days [28], and training one model across many series (cross-learning) helps [29]. The textbook advice to split by time and always report a naive baseline [7], [9] guided our evaluation. Deep models such as the Temporal Fusion Transformer [30] are accurate but heavy, and the brief for this course was classical machine learning, so we did not use them.</w:t>
+        <w:t xml:space="preserve"> Surveys show a clear move from classical time-series models to data-driven methods [25], [2]. In the M5 competition on Walmart data, machine-learning methods, most of them built on LightGBM, beat the statistical benchmarks [3]. Gradient-boosted trees are the workhorse for this kind of tabular data and LightGBM trains much faster than older boosting at similar accuracy [26]. Three findings shaped our features: promotions need explicit features [27], calendar special days behave differently from normal days [28], and training one model across many series (cross-learning) helps [29]. The textbook advice to split by time and always report a naive baseline [7], [9] guided our evaluation. Deep models such as the Temporal Fusion Transformer [30] are accurate but heavy, and the brief for this course was classical machine learning, so we did not use them.</w:t>
       </w:r>
     </w:p>
     <w:p>
@@ -12882,15 +12588,7 @@
         <w:t>Accuracy is not the same as a good decision.</w:t>
       </w:r>
       <w:r>
-        <w:t xml:space="preserve"> Theodorou et al. showed on M5 data that the most accurate forecast is not always the cheapest to stock against [32]. Prescriptive methods [33], [34] </w:t>
-      </w:r>
-      <w:proofErr w:type="spellStart"/>
-      <w:r>
-        <w:t>optimise</w:t>
-      </w:r>
-      <w:proofErr w:type="spellEnd"/>
-      <w:r>
-        <w:t xml:space="preserve"> the order directly and report large savings, but they are hard for a store manager to check. Inventory theory offers a transparent alternative: a periodic-review order-up-to policy whose safety stock covers both forecast error and late deliveries [4], [10], [12]. We keep this readable rule and feed it with machine-learning forecasts and quantiles.</w:t>
+        <w:t xml:space="preserve"> Theodorou et al. showed on M5 data that the most accurate forecast is not always the cheapest to stock against [32]. Prescriptive methods [33], [34] optimise the order directly and report large savings, but they are hard for a store manager to check. Inventory theory offers a transparent alternative: a periodic-review order-up-to policy whose safety stock covers both forecast error and late deliveries [4], [10], [12]. We keep this readable rule and feed it with machine-learning forecasts and quantiles.</w:t>
       </w:r>
     </w:p>
     <w:p>
@@ -12904,23 +12602,7 @@
         <w:t>Explanations usually stop at the forecast.</w:t>
       </w:r>
       <w:r>
-        <w:t xml:space="preserve"> SHAP gives each feature a fair share of an individual prediction [35] and has an exact, fast version for tree models [39]. The closest work to ours, Mishra et al., combines </w:t>
-      </w:r>
-      <w:proofErr w:type="spellStart"/>
-      <w:r>
-        <w:t>LightGBM</w:t>
-      </w:r>
-      <w:proofErr w:type="spellEnd"/>
-      <w:r>
-        <w:t xml:space="preserve"> with four explanation layers [36]; </w:t>
-      </w:r>
-      <w:proofErr w:type="spellStart"/>
-      <w:r>
-        <w:t>Rožanec</w:t>
-      </w:r>
-      <w:proofErr w:type="spellEnd"/>
-      <w:r>
-        <w:t xml:space="preserve"> et al. enrich explanations with external knowledge [37]. In both, the explanation is attached to the forecast only. Finally, a what-if result shows what the model learned, not what would really happen: naive machine-learning effect estimates are biased [38], and causal claims need a causal design [23]. We therefore label every what-if output as model behaviour.</w:t>
+        <w:t xml:space="preserve"> SHAP gives each feature a fair share of an individual prediction [35] and has an exact, fast version for tree models [39]. The closest work to ours, Mishra et al., combines LightGBM with four explanation layers [36]; Rožanec et al. enrich explanations with external knowledge [37]. In both, the explanation is attached to the forecast only. Finally, a what-if result shows what the model learned, not what would really happen: naive machine-learning effect estimates are biased [38], and causal claims need a causal design [23]. We therefore label every what-if output as model behaviour.</w:t>
       </w:r>
     </w:p>
     <w:p/>
@@ -12976,15 +12658,7 @@
         <w:jc w:val="both"/>
       </w:pPr>
       <w:r>
-        <w:t xml:space="preserve">Reading the books and papers side by side, we found six gaps. Each is tied to specific sources and to the way </w:t>
-      </w:r>
-      <w:proofErr w:type="spellStart"/>
-      <w:r>
-        <w:t>DemandIQ</w:t>
-      </w:r>
-      <w:proofErr w:type="spellEnd"/>
-      <w:r>
-        <w:t xml:space="preserve"> responds to it.</w:t>
+        <w:t>Reading the books and papers side by side, we found six gaps. Each is tied to specific sources and to the way DemandIQ responds to it.</w:t>
       </w:r>
     </w:p>
     <w:p>
@@ -13009,21 +12683,7 @@
         <w:rPr>
           <w:color w:val="auto"/>
         </w:rPr>
-        <w:t xml:space="preserve">Research gaps identified and </w:t>
-      </w:r>
-      <w:proofErr w:type="spellStart"/>
-      <w:r>
-        <w:rPr>
-          <w:color w:val="auto"/>
-        </w:rPr>
-        <w:t>DemandIQ's</w:t>
-      </w:r>
-      <w:proofErr w:type="spellEnd"/>
-      <w:r>
-        <w:rPr>
-          <w:color w:val="auto"/>
-        </w:rPr>
-        <w:t xml:space="preserve"> response</w:t>
+        <w:t>Research gaps identified and DemandIQ's response</w:t>
       </w:r>
       <w:bookmarkEnd w:id="20"/>
     </w:p>
@@ -13111,21 +12771,12 @@
               <w:spacing w:after="0"/>
               <w:jc w:val="center"/>
             </w:pPr>
-            <w:proofErr w:type="spellStart"/>
             <w:r>
               <w:rPr>
                 <w:b/>
                 <w:sz w:val="18"/>
               </w:rPr>
-              <w:t>DemandIQ</w:t>
-            </w:r>
-            <w:proofErr w:type="spellEnd"/>
-            <w:r>
-              <w:rPr>
-                <w:b/>
-                <w:sz w:val="18"/>
-              </w:rPr>
-              <w:t xml:space="preserve"> response</w:t>
+              <w:t>DemandIQ response</w:t>
             </w:r>
           </w:p>
         </w:tc>
@@ -13732,7 +13383,6 @@
       <w:r>
         <w:t xml:space="preserve">For store </w:t>
       </w:r>
-      <w:proofErr w:type="spellStart"/>
       <w:r>
         <w:rPr>
           <w:i/>
@@ -13740,20 +13390,14 @@
         <w:t>s</w:t>
       </w:r>
       <w:r>
-        <w:t xml:space="preserve"> on</w:t>
-      </w:r>
-      <w:proofErr w:type="spellEnd"/>
-      <w:r>
-        <w:t xml:space="preserve"> day </w:t>
-      </w:r>
-      <w:proofErr w:type="spellStart"/>
+        <w:t xml:space="preserve"> on day </w:t>
+      </w:r>
       <w:r>
         <w:rPr>
           <w:i/>
         </w:rPr>
         <w:t>t</w:t>
       </w:r>
-      <w:proofErr w:type="spellEnd"/>
       <w:r>
         <w:t xml:space="preserve"> let </w:t>
       </w:r>
@@ -13764,17 +13408,7 @@
         <w:t>x</w:t>
       </w:r>
       <w:r>
-        <w:t>(</w:t>
-      </w:r>
-      <w:proofErr w:type="spellStart"/>
-      <w:proofErr w:type="gramStart"/>
-      <w:r>
-        <w:t>s,t</w:t>
-      </w:r>
-      <w:proofErr w:type="spellEnd"/>
-      <w:proofErr w:type="gramEnd"/>
-      <w:r>
-        <w:t>) be the feature vector known in advance (calendar, promotion, holidays, store profile and sales history that is at least seven days old). The project contains four learning tasks:</w:t>
+        <w:t>(s,t) be the feature vector known in advance (calendar, promotion, holidays, store profile and sales history that is at least seven days old). The project contains four learning tasks:</w:t>
       </w:r>
     </w:p>
     <w:p>
@@ -13799,17 +13433,9 @@
         <w:rPr>
           <w:color w:val="auto"/>
         </w:rPr>
-        <w:t xml:space="preserve">Learning tasks in </w:t>
-      </w:r>
-      <w:proofErr w:type="spellStart"/>
-      <w:r>
-        <w:rPr>
-          <w:color w:val="auto"/>
-        </w:rPr>
-        <w:t>DemandIQ</w:t>
+        <w:t>Learning tasks in DemandIQ</w:t>
       </w:r>
       <w:bookmarkEnd w:id="24"/>
-      <w:proofErr w:type="spellEnd"/>
     </w:p>
     <w:tbl>
       <w:tblPr>
@@ -13950,56 +13576,24 @@
               <w:rPr>
                 <w:sz w:val="19"/>
               </w:rPr>
-              <w:t>x(</w:t>
-            </w:r>
-            <w:proofErr w:type="spellStart"/>
-            <w:proofErr w:type="gramStart"/>
+              <w:t>x(s,t), 27 features</w:t>
+            </w:r>
+          </w:p>
+        </w:tc>
+        <w:tc>
+          <w:tcPr>
+            <w:tcW w:w="2448" w:type="dxa"/>
+          </w:tcPr>
+          <w:p>
+            <w:pPr>
+              <w:keepNext/>
+              <w:spacing w:after="0"/>
+            </w:pPr>
             <w:r>
               <w:rPr>
                 <w:sz w:val="19"/>
               </w:rPr>
-              <w:t>s,t</w:t>
-            </w:r>
-            <w:proofErr w:type="spellEnd"/>
-            <w:proofErr w:type="gramEnd"/>
-            <w:r>
-              <w:rPr>
-                <w:sz w:val="19"/>
-              </w:rPr>
-              <w:t>), 27 features</w:t>
-            </w:r>
-          </w:p>
-        </w:tc>
-        <w:tc>
-          <w:tcPr>
-            <w:tcW w:w="2448" w:type="dxa"/>
-          </w:tcPr>
-          <w:p>
-            <w:pPr>
-              <w:keepNext/>
-              <w:spacing w:after="0"/>
-            </w:pPr>
-            <w:r>
-              <w:rPr>
-                <w:sz w:val="19"/>
-              </w:rPr>
-              <w:t>Sales y(</w:t>
-            </w:r>
-            <w:proofErr w:type="spellStart"/>
-            <w:proofErr w:type="gramStart"/>
-            <w:r>
-              <w:rPr>
-                <w:sz w:val="19"/>
-              </w:rPr>
-              <w:t>s,t</w:t>
-            </w:r>
-            <w:proofErr w:type="spellEnd"/>
-            <w:proofErr w:type="gramEnd"/>
-            <w:r>
-              <w:rPr>
-                <w:sz w:val="19"/>
-              </w:rPr>
-              <w:t>); quantiles q0.1 and q0.9</w:t>
+              <w:t>Sales y(s,t); quantiles q0.1 and q0.9</w:t>
             </w:r>
           </w:p>
         </w:tc>
@@ -14065,33 +13659,11 @@
               <w:keepNext/>
               <w:spacing w:after="0"/>
             </w:pPr>
-            <w:proofErr w:type="gramStart"/>
             <w:r>
               <w:rPr>
                 <w:sz w:val="19"/>
               </w:rPr>
-              <w:t>P(</w:t>
-            </w:r>
-            <w:proofErr w:type="gramEnd"/>
-            <w:r>
-              <w:rPr>
-                <w:sz w:val="19"/>
-              </w:rPr>
-              <w:t>stockout on any of days t+</w:t>
-            </w:r>
-            <w:proofErr w:type="gramStart"/>
-            <w:r>
-              <w:rPr>
-                <w:sz w:val="19"/>
-              </w:rPr>
-              <w:t>1..</w:t>
-            </w:r>
-            <w:proofErr w:type="gramEnd"/>
-            <w:r>
-              <w:rPr>
-                <w:sz w:val="19"/>
-              </w:rPr>
-              <w:t>t+3)</w:t>
+              <w:t>P(stockout on any of days t+1..t+3)</w:t>
             </w:r>
           </w:p>
         </w:tc>
@@ -14161,23 +13733,7 @@
               <w:rPr>
                 <w:sz w:val="19"/>
               </w:rPr>
-              <w:t>Order quantity Q(</w:t>
-            </w:r>
-            <w:proofErr w:type="spellStart"/>
-            <w:proofErr w:type="gramStart"/>
-            <w:r>
-              <w:rPr>
-                <w:sz w:val="19"/>
-              </w:rPr>
-              <w:t>s,t</w:t>
-            </w:r>
-            <w:proofErr w:type="spellEnd"/>
-            <w:proofErr w:type="gramEnd"/>
-            <w:r>
-              <w:rPr>
-                <w:sz w:val="19"/>
-              </w:rPr>
-              <w:t>) &gt;= 0</w:t>
+              <w:t>Order quantity Q(s,t) &gt;= 0</w:t>
             </w:r>
           </w:p>
         </w:tc>
@@ -14259,17 +13815,7 @@
         <w:jc w:val="both"/>
       </w:pPr>
       <w:r>
-        <w:t>The demand model learns f such that ŷ(</w:t>
-      </w:r>
-      <w:proofErr w:type="spellStart"/>
-      <w:proofErr w:type="gramStart"/>
-      <w:r>
-        <w:t>s,t</w:t>
-      </w:r>
-      <w:proofErr w:type="spellEnd"/>
-      <w:proofErr w:type="gramEnd"/>
-      <w:r>
-        <w:t>) = f(</w:t>
+        <w:t>The demand model learns f such that ŷ(s,t) = f(</w:t>
       </w:r>
       <w:r>
         <w:rPr>
@@ -14278,47 +13824,19 @@
         <w:t>x</w:t>
       </w:r>
       <w:r>
-        <w:t>(</w:t>
-      </w:r>
-      <w:proofErr w:type="spellStart"/>
-      <w:proofErr w:type="gramStart"/>
-      <w:r>
-        <w:t>s,t</w:t>
-      </w:r>
-      <w:proofErr w:type="spellEnd"/>
-      <w:proofErr w:type="gramEnd"/>
-      <w:r>
-        <w:t xml:space="preserve">)) </w:t>
+        <w:t xml:space="preserve">(s,t)) </w:t>
       </w:r>
       <w:r>
         <w:t>minimizes</w:t>
       </w:r>
       <w:r>
-        <w:t xml:space="preserve"> squared error on </w:t>
-      </w:r>
-      <w:proofErr w:type="gramStart"/>
-      <w:r>
-        <w:t>log(</w:t>
-      </w:r>
-      <w:proofErr w:type="gramEnd"/>
-      <w:r>
-        <w:t xml:space="preserve">1 + sales), which is close to </w:t>
+        <w:t xml:space="preserve"> squared error on log(1 + sales), which is close to </w:t>
       </w:r>
       <w:r>
         <w:t>minimizing</w:t>
       </w:r>
       <w:r>
-        <w:t xml:space="preserve"> percentage error. The risk model learns g such that p(</w:t>
-      </w:r>
-      <w:proofErr w:type="spellStart"/>
-      <w:proofErr w:type="gramStart"/>
-      <w:r>
-        <w:t>s,t</w:t>
-      </w:r>
-      <w:proofErr w:type="spellEnd"/>
-      <w:proofErr w:type="gramEnd"/>
-      <w:r>
-        <w:t>) = g(</w:t>
+        <w:t xml:space="preserve"> percentage error. The risk model learns g such that p(s,t) = g(</w:t>
       </w:r>
       <w:r>
         <w:rPr>
@@ -14327,17 +13845,7 @@
         <w:t>z</w:t>
       </w:r>
       <w:r>
-        <w:t>(</w:t>
-      </w:r>
-      <w:proofErr w:type="spellStart"/>
-      <w:proofErr w:type="gramStart"/>
-      <w:r>
-        <w:t>s,t</w:t>
-      </w:r>
-      <w:proofErr w:type="spellEnd"/>
-      <w:proofErr w:type="gramEnd"/>
-      <w:r>
-        <w:t xml:space="preserve">)) estimates the probability of a stockout, where </w:t>
+        <w:t xml:space="preserve">(s,t)) estimates the probability of a stockout, where </w:t>
       </w:r>
       <w:r>
         <w:rPr>
@@ -14862,15 +14370,7 @@
         <w:jc w:val="both"/>
       </w:pPr>
       <w:r>
-        <w:t xml:space="preserve">Fig. 1 shows the full pipeline. Raw data is cleaned and turned into features; stores are segmented; a regression model forecasts demand; an inventory replay produces stock levels on which a classifier learns stockout risk; a decision rule converts forecasts and risk into orders; SHAP explains both models; and a </w:t>
-      </w:r>
-      <w:proofErr w:type="spellStart"/>
-      <w:r>
-        <w:t>Streamlit</w:t>
-      </w:r>
-      <w:proofErr w:type="spellEnd"/>
-      <w:r>
-        <w:t xml:space="preserve"> dashboard puts everything in front of the user. Each block is one Python script, run in order by run_all.py.</w:t>
+        <w:t>Fig. 1 shows the full pipeline. Raw data is cleaned and turned into features; stores are segmented; a regression model forecasts demand; an inventory replay produces stock levels on which a classifier learns stockout risk; a decision rule converts forecasts and risk into orders; SHAP explains both models; and a Streamlit dashboard puts everything in front of the user. Each block is one Python script, run in order by run_all.py.</w:t>
       </w:r>
     </w:p>
     <w:p>
@@ -14941,21 +14441,7 @@
         <w:rPr>
           <w:color w:val="auto"/>
         </w:rPr>
-        <w:t xml:space="preserve">System architecture of </w:t>
-      </w:r>
-      <w:proofErr w:type="spellStart"/>
-      <w:r>
-        <w:rPr>
-          <w:color w:val="auto"/>
-        </w:rPr>
-        <w:t>DemandIQ</w:t>
-      </w:r>
-      <w:proofErr w:type="spellEnd"/>
-      <w:r>
-        <w:rPr>
-          <w:color w:val="auto"/>
-        </w:rPr>
-        <w:t xml:space="preserve"> (numbers match the pipeline scripts).</w:t>
+        <w:t>System architecture of DemandIQ (numbers match the pipeline scripts).</w:t>
       </w:r>
       <w:bookmarkEnd w:id="30"/>
     </w:p>
@@ -15094,16 +14580,8 @@
               <w:rPr>
                 <w:sz w:val="20"/>
               </w:rPr>
-              <w:t xml:space="preserve">Store, Date, </w:t>
-            </w:r>
-            <w:proofErr w:type="spellStart"/>
-            <w:r>
-              <w:rPr>
-                <w:sz w:val="20"/>
-              </w:rPr>
-              <w:t>DayOfWeek</w:t>
-            </w:r>
-            <w:proofErr w:type="spellEnd"/>
+              <w:t>Store, Date, DayOfWeek</w:t>
+            </w:r>
           </w:p>
         </w:tc>
         <w:tc>
@@ -15242,28 +14720,12 @@
               <w:keepNext/>
               <w:spacing w:after="0"/>
             </w:pPr>
-            <w:proofErr w:type="spellStart"/>
             <w:r>
               <w:rPr>
                 <w:sz w:val="20"/>
               </w:rPr>
-              <w:t>StateHoliday</w:t>
-            </w:r>
-            <w:proofErr w:type="spellEnd"/>
-            <w:r>
-              <w:rPr>
-                <w:sz w:val="20"/>
-              </w:rPr>
-              <w:t xml:space="preserve">, </w:t>
-            </w:r>
-            <w:proofErr w:type="spellStart"/>
-            <w:r>
-              <w:rPr>
-                <w:sz w:val="20"/>
-              </w:rPr>
-              <w:t>SchoolHoliday</w:t>
-            </w:r>
-            <w:proofErr w:type="spellEnd"/>
+              <w:t>StateHoliday, SchoolHoliday</w:t>
+            </w:r>
           </w:p>
         </w:tc>
         <w:tc>
@@ -15294,19 +14756,11 @@
               <w:keepNext/>
               <w:spacing w:after="0"/>
             </w:pPr>
-            <w:proofErr w:type="spellStart"/>
             <w:r>
               <w:rPr>
                 <w:sz w:val="20"/>
               </w:rPr>
-              <w:t>StoreType</w:t>
-            </w:r>
-            <w:proofErr w:type="spellEnd"/>
-            <w:r>
-              <w:rPr>
-                <w:sz w:val="20"/>
-              </w:rPr>
-              <w:t>, Assortment</w:t>
+              <w:t>StoreType, Assortment</w:t>
             </w:r>
           </w:p>
         </w:tc>
@@ -15337,43 +14791,27 @@
             <w:pPr>
               <w:spacing w:after="0"/>
             </w:pPr>
-            <w:proofErr w:type="spellStart"/>
             <w:r>
               <w:rPr>
                 <w:sz w:val="20"/>
               </w:rPr>
-              <w:t>CompetitionDistance</w:t>
-            </w:r>
-            <w:proofErr w:type="spellEnd"/>
+              <w:t>CompetitionDistance, ...Since</w:t>
+            </w:r>
+          </w:p>
+        </w:tc>
+        <w:tc>
+          <w:tcPr>
+            <w:tcW w:w="6048" w:type="dxa"/>
+          </w:tcPr>
+          <w:p>
+            <w:pPr>
+              <w:spacing w:after="0"/>
+            </w:pPr>
             <w:r>
               <w:rPr>
                 <w:sz w:val="20"/>
               </w:rPr>
-              <w:t>, ...Since</w:t>
-            </w:r>
-          </w:p>
-        </w:tc>
-        <w:tc>
-          <w:tcPr>
-            <w:tcW w:w="6048" w:type="dxa"/>
-          </w:tcPr>
-          <w:p>
-            <w:pPr>
-              <w:spacing w:after="0"/>
-            </w:pPr>
-            <w:proofErr w:type="spellStart"/>
-            <w:r>
-              <w:rPr>
-                <w:sz w:val="20"/>
-              </w:rPr>
-              <w:t>Metres</w:t>
-            </w:r>
-            <w:proofErr w:type="spellEnd"/>
-            <w:r>
-              <w:rPr>
-                <w:sz w:val="20"/>
-              </w:rPr>
-              <w:t xml:space="preserve"> to the nearest competitor and when it opened</w:t>
+              <w:t>Metres to the nearest competitor and when it opened</w:t>
             </w:r>
           </w:p>
         </w:tc>
@@ -15781,15 +15219,7 @@
         <w:t>Cleaning.</w:t>
       </w:r>
       <w:r>
-        <w:t xml:space="preserve"> (</w:t>
-      </w:r>
-      <w:proofErr w:type="spellStart"/>
-      <w:r>
-        <w:t>i</w:t>
-      </w:r>
-      <w:proofErr w:type="spellEnd"/>
-      <w:r>
-        <w:t>) 180 stores were closed for refurbishment for six months in 2014; their histories have a hole that breaks lag features and the stock simulation, so we keep the 935 stores with a complete record. (ii) 54 days marked open with zero sales were treated as closed. (iii) Each store was re-indexed to a full calendar, so that "seven days ago" always means seven calendar days. (iv) Missing competitor distances (3 stores in the master file) were filled with the median; missing competitor opening dates were treated as long-established competitors. (v) Closed days are kept in the calendar for the simulation but excluded from model training, giving 732,379 trading days.</w:t>
+        <w:t xml:space="preserve"> (i) 180 stores were closed for refurbishment for six months in 2014; their histories have a hole that breaks lag features and the stock simulation, so we keep the 935 stores with a complete record. (ii) 54 days marked open with zero sales were treated as closed. (iii) Each store was re-indexed to a full calendar, so that "seven days ago" always means seven calendar days. (iv) Missing competitor distances (3 stores in the master file) were filled with the median; missing competitor opening dates were treated as long-established competitors. (v) Closed days are kept in the calendar for the simulation but excluded from model training, giving 732,379 trading days.</w:t>
       </w:r>
     </w:p>
     <w:p>
@@ -15803,15 +15233,7 @@
         <w:t>Encoding.</w:t>
       </w:r>
       <w:r>
-        <w:t xml:space="preserve"> Store type, assortment, holiday type and segment are small categories and are given as integer codes to the tree models; the Ridge and Logistic Regression models use one-hot encoding and </w:t>
-      </w:r>
-      <w:proofErr w:type="spellStart"/>
-      <w:r>
-        <w:t>standardised</w:t>
-      </w:r>
-      <w:proofErr w:type="spellEnd"/>
-      <w:r>
-        <w:t xml:space="preserve"> numeric features, with median imputation for missing lags.</w:t>
+        <w:t xml:space="preserve"> Store type, assortment, holiday type and segment are small categories and are given as integer codes to the tree models; the Ridge and Logistic Regression models use one-hot encoding and standardised numeric features, with median imputation for missing lags.</w:t>
       </w:r>
     </w:p>
     <w:p>
@@ -16213,15 +15635,7 @@
         <w:t>Store segmentation (K-Means).</w:t>
       </w:r>
       <w:r>
-        <w:t xml:space="preserve"> For each store we compute six traits on the training window: average daily sales, promotion uplift, day-to-day volatility (coefficient of variation), Saturday-to-weekday sales ratio, December uplift and log competitor distance. After </w:t>
-      </w:r>
-      <w:proofErr w:type="spellStart"/>
-      <w:r>
-        <w:t>standardising</w:t>
-      </w:r>
-      <w:proofErr w:type="spellEnd"/>
-      <w:r>
-        <w:t>, K-Means [40] is run for k = 2 to 8. The silhouette score [41] is low for every k (0.18-0.25), which shows that stores form a continuum rather than sharply separated groups; we choose k = 4 where the elbow flattens and the groups are easy to name and act on (Fig. 2). The segment number becomes a feature of both models.</w:t>
+        <w:t xml:space="preserve"> For each store we compute six traits on the training window: average daily sales, promotion uplift, day-to-day volatility (coefficient of variation), Saturday-to-weekday sales ratio, December uplift and log competitor distance. After standardising, K-Means [40] is run for k = 2 to 8. The silhouette score [41] is low for every k (0.18-0.25), which shows that stores form a continuum rather than sharply separated groups; we choose k = 4 where the elbow flattens and the groups are easy to name and act on (Fig. 2). The segment number becomes a feature of both models.</w:t>
       </w:r>
     </w:p>
     <w:p>
@@ -16678,21 +16092,7 @@
               <w:rPr>
                 <w:sz w:val="19"/>
               </w:rPr>
-              <w:t>Histogram-based boosting (</w:t>
-            </w:r>
-            <w:proofErr w:type="spellStart"/>
-            <w:r>
-              <w:rPr>
-                <w:sz w:val="19"/>
-              </w:rPr>
-              <w:t>LightGBM</w:t>
-            </w:r>
-            <w:proofErr w:type="spellEnd"/>
-            <w:r>
-              <w:rPr>
-                <w:sz w:val="19"/>
-              </w:rPr>
-              <w:t>-style) - state of the art on tabular retail data [3]</w:t>
+              <w:t>Histogram-based boosting (LightGBM-style) - state of the art on tabular retail data [3]</w:t>
             </w:r>
           </w:p>
         </w:tc>
@@ -17006,15 +16406,7 @@
         <w:t>Set-up.</w:t>
       </w:r>
       <w:r>
-        <w:t xml:space="preserve"> Python 3 with pandas, NumPy, scikit-learn [45], SHAP and Matplotlib; the dashboard uses </w:t>
-      </w:r>
-      <w:proofErr w:type="spellStart"/>
-      <w:r>
-        <w:t>Streamlit</w:t>
-      </w:r>
-      <w:proofErr w:type="spellEnd"/>
-      <w:r>
-        <w:t>. Everything runs on an ordinary laptop CPU (no GPU); the full pipeline takes about eight minutes. A fixed random seed (42) makes every run reproducible.</w:t>
+        <w:t xml:space="preserve"> Python 3 with pandas, NumPy, scikit-learn [45], SHAP and Matplotlib; the dashboard uses Streamlit. Everything runs on an ordinary laptop CPU (no GPU); the full pipeline takes about eight minutes. A fixed random seed (42) makes every run reproducible.</w:t>
       </w:r>
     </w:p>
     <w:p>
@@ -17028,47 +16420,7 @@
         <w:t>Loss functions.</w:t>
       </w:r>
       <w:r>
-        <w:t xml:space="preserve"> Demand models </w:t>
-      </w:r>
-      <w:proofErr w:type="spellStart"/>
-      <w:r>
-        <w:t>minimise</w:t>
-      </w:r>
-      <w:proofErr w:type="spellEnd"/>
-      <w:r>
-        <w:t xml:space="preserve"> squared error on </w:t>
-      </w:r>
-      <w:proofErr w:type="gramStart"/>
-      <w:r>
-        <w:t>log(</w:t>
-      </w:r>
-      <w:proofErr w:type="gramEnd"/>
-      <w:r>
-        <w:t xml:space="preserve">1 + sales), so a 10% miss costs the same for a small and a large store. Quantile models </w:t>
-      </w:r>
-      <w:proofErr w:type="spellStart"/>
-      <w:r>
-        <w:t>minimise</w:t>
-      </w:r>
-      <w:proofErr w:type="spellEnd"/>
-      <w:r>
-        <w:t xml:space="preserve"> the pinball loss at 0.1 and 0.9. Classifiers </w:t>
-      </w:r>
-      <w:proofErr w:type="spellStart"/>
-      <w:r>
-        <w:t>minimise</w:t>
-      </w:r>
-      <w:proofErr w:type="spellEnd"/>
-      <w:r>
-        <w:t xml:space="preserve"> log-loss (binary cross-entropy). Gradient boosting fits each new tree to the gradient of the loss (it has no separate </w:t>
-      </w:r>
-      <w:proofErr w:type="spellStart"/>
-      <w:r>
-        <w:t>optimiser</w:t>
-      </w:r>
-      <w:proofErr w:type="spellEnd"/>
-      <w:r>
-        <w:t xml:space="preserve"> such as Adam); trees play the role of epochs.</w:t>
+        <w:t xml:space="preserve"> Demand models minimise squared error on log(1 + sales), so a 10% miss costs the same for a small and a large store. Quantile models minimise the pinball loss at 0.1 and 0.9. Classifiers minimise log-loss (binary cross-entropy). Gradient boosting fits each new tree to the gradient of the loss (it has no separate optimiser such as Adam); trees play the role of epochs.</w:t>
       </w:r>
     </w:p>
     <w:p>
@@ -17100,23 +16452,7 @@
         <w:t>Overfitting control.</w:t>
       </w:r>
       <w:r>
-        <w:t xml:space="preserve"> Time-based validation, a minimum leaf size, L2 </w:t>
-      </w:r>
-      <w:proofErr w:type="spellStart"/>
-      <w:r>
-        <w:t>regularisation</w:t>
-      </w:r>
-      <w:proofErr w:type="spellEnd"/>
-      <w:r>
-        <w:t xml:space="preserve"> and choosing the number of trees from the validation loss curve (Fig. 3). The validation loss flattens after about 200 trees while the training loss keeps falling slowly, so more trees would only </w:t>
-      </w:r>
-      <w:proofErr w:type="spellStart"/>
-      <w:r>
-        <w:t>memorise</w:t>
-      </w:r>
-      <w:proofErr w:type="spellEnd"/>
-      <w:r>
-        <w:t xml:space="preserve"> the past.</w:t>
+        <w:t xml:space="preserve"> Time-based validation, a minimum leaf size, L2 regularisation and choosing the number of trees from the validation loss curve (Fig. 3). The validation loss flattens after about 200 trees while the training loss keeps falling slowly, so more trees would only memorise the past.</w:t>
       </w:r>
     </w:p>
     <w:p>
@@ -17226,15 +16562,7 @@
         <w:jc w:val="both"/>
       </w:pPr>
       <w:r>
-        <w:t xml:space="preserve">Rossmann does not record stock, so we rebuild it [13]. Every evening on Monday and Thursday the store orders up to a target level S; the delivery arrives two days later, or later if the supplier is late. Each day, customers buy </w:t>
-      </w:r>
-      <w:proofErr w:type="gramStart"/>
-      <w:r>
-        <w:t>min(</w:t>
-      </w:r>
-      <w:proofErr w:type="gramEnd"/>
-      <w:r>
-        <w:t>stock, demand); unmet demand is lost and the day is a stockout day. Three ordering policies are compared:</w:t>
+        <w:t>Rossmann does not record stock, so we rebuild it [13]. Every evening on Monday and Thursday the store orders up to a target level S; the delivery arrives two days later, or later if the supplier is late. Each day, customers buy min(stock, demand); unmet demand is lost and the day is a stockout day. Three ordering policies are compared:</w:t>
       </w:r>
     </w:p>
     <w:p>
@@ -17261,21 +16589,7 @@
         <w:rPr>
           <w:b/>
         </w:rPr>
-        <w:t xml:space="preserve">B. </w:t>
-      </w:r>
-      <w:proofErr w:type="spellStart"/>
-      <w:r>
-        <w:rPr>
-          <w:b/>
-        </w:rPr>
-        <w:t>DemandIQ</w:t>
-      </w:r>
-      <w:proofErr w:type="spellEnd"/>
-      <w:r>
-        <w:rPr>
-          <w:b/>
-        </w:rPr>
-        <w:t xml:space="preserve"> forecast</w:t>
+        <w:t>B. DemandIQ forecast</w:t>
       </w:r>
       <w:r>
         <w:t xml:space="preserve"> - the textbook periodic-review policy [4] fed with the ML forecast:</w:t>
@@ -17291,81 +16605,8 @@
           <w:rFonts w:ascii="Cambria Math" w:hAnsi="Cambria Math"/>
           <w:i/>
         </w:rPr>
-        <w:t>S = Σ F(d</w:t>
-      </w:r>
-      <w:proofErr w:type="gramStart"/>
-      <w:r>
-        <w:rPr>
-          <w:rFonts w:ascii="Cambria Math" w:hAnsi="Cambria Math"/>
-          <w:i/>
-        </w:rPr>
-        <w:t>)  +</w:t>
-      </w:r>
-      <w:proofErr w:type="gramEnd"/>
-      <w:r>
-        <w:rPr>
-          <w:rFonts w:ascii="Cambria Math" w:hAnsi="Cambria Math"/>
-          <w:i/>
-        </w:rPr>
-        <w:t xml:space="preserve">  E[delay] · </w:t>
-      </w:r>
-      <w:proofErr w:type="gramStart"/>
-      <w:r>
-        <w:rPr>
-          <w:rFonts w:ascii="Cambria Math" w:hAnsi="Cambria Math"/>
-          <w:i/>
-        </w:rPr>
-        <w:t>F̄  +</w:t>
-      </w:r>
-      <w:proofErr w:type="gramEnd"/>
-      <w:r>
-        <w:rPr>
-          <w:rFonts w:ascii="Cambria Math" w:hAnsi="Cambria Math"/>
-          <w:i/>
-        </w:rPr>
-        <w:t xml:space="preserve">  z · </w:t>
-      </w:r>
-      <w:proofErr w:type="gramStart"/>
-      <w:r>
-        <w:rPr>
-          <w:rFonts w:ascii="Cambria Math" w:hAnsi="Cambria Math"/>
-          <w:i/>
-        </w:rPr>
-        <w:t>√( Σ</w:t>
-      </w:r>
-      <w:proofErr w:type="gramEnd"/>
-      <w:r>
-        <w:rPr>
-          <w:rFonts w:ascii="Cambria Math" w:hAnsi="Cambria Math"/>
-          <w:i/>
-        </w:rPr>
-        <w:t xml:space="preserve"> σ(d)</w:t>
-      </w:r>
-      <w:proofErr w:type="gramStart"/>
-      <w:r>
-        <w:rPr>
-          <w:rFonts w:ascii="Cambria Math" w:hAnsi="Cambria Math"/>
-          <w:i/>
-        </w:rPr>
-        <w:t>²  +</w:t>
-      </w:r>
-      <w:proofErr w:type="gramEnd"/>
-      <w:r>
-        <w:rPr>
-          <w:rFonts w:ascii="Cambria Math" w:hAnsi="Cambria Math"/>
-          <w:i/>
-        </w:rPr>
-        <w:t xml:space="preserve">  F̄² · Var[delay</w:t>
-      </w:r>
-      <w:proofErr w:type="gramStart"/>
-      <w:r>
-        <w:rPr>
-          <w:rFonts w:ascii="Cambria Math" w:hAnsi="Cambria Math"/>
-          <w:i/>
-        </w:rPr>
-        <w:t>] )</w:t>
-      </w:r>
-      <w:proofErr w:type="gramEnd"/>
+        <w:t>S = Σ F(d)  +  E[delay] · F̄  +  z · √( Σ σ(d)²  +  F̄² · Var[delay] )</w:t>
+      </w:r>
     </w:p>
     <w:p>
       <w:pPr>
@@ -17373,15 +16614,7 @@
         <w:jc w:val="both"/>
       </w:pPr>
       <w:r>
-        <w:t xml:space="preserve">where F(d) is the forecast for each day d until the next delivery, F̄ the average daily forecast, σ(d) = (P90 - P10) / 2.563 the forecast uncertainty from the quantile models, E[delay] = 0.25 days and Var[delay] = 0.29 come from the supplier lateness, and z = 1.645 targets a 95% cycle service level [10]. The order quantity is Q = </w:t>
-      </w:r>
-      <w:proofErr w:type="gramStart"/>
-      <w:r>
-        <w:t>max(</w:t>
-      </w:r>
-      <w:proofErr w:type="gramEnd"/>
-      <w:r>
-        <w:t>0, S - stock on hand - stock on order).</w:t>
+        <w:t>where F(d) is the forecast for each day d until the next delivery, F̄ the average daily forecast, σ(d) = (P90 - P10) / 2.563 the forecast uncertainty from the quantile models, E[delay] = 0.25 days and Var[delay] = 0.29 come from the supplier lateness, and z = 1.645 targets a 95% cycle service level [10]. The order quantity is Q = max(0, S - stock on hand - stock on order).</w:t>
       </w:r>
     </w:p>
     <w:p>
@@ -17393,21 +16626,7 @@
         <w:rPr>
           <w:b/>
         </w:rPr>
-        <w:t xml:space="preserve">C. </w:t>
-      </w:r>
-      <w:proofErr w:type="spellStart"/>
-      <w:r>
-        <w:rPr>
-          <w:b/>
-        </w:rPr>
-        <w:t>DemandIQ</w:t>
-      </w:r>
-      <w:proofErr w:type="spellEnd"/>
-      <w:r>
-        <w:rPr>
-          <w:b/>
-        </w:rPr>
-        <w:t xml:space="preserve"> + risk alerts</w:t>
+        <w:t>C. DemandIQ + risk alerts</w:t>
       </w:r>
       <w:r>
         <w:t xml:space="preserve"> - policy B, plus: on non-ordering days, if the risk classifier gives a probability above a threshold, place an emergency order that arrives the next morning. The threshold (0.15) is chosen on the validation window by lowest total cost.</w:t>
@@ -17632,19 +16851,11 @@
               <w:keepNext/>
               <w:spacing w:after="0"/>
             </w:pPr>
-            <w:proofErr w:type="spellStart"/>
             <w:r>
               <w:rPr>
                 <w:sz w:val="19"/>
               </w:rPr>
-              <w:t>Penalise</w:t>
-            </w:r>
-            <w:proofErr w:type="spellEnd"/>
-            <w:r>
-              <w:rPr>
-                <w:sz w:val="19"/>
-              </w:rPr>
-              <w:t xml:space="preserve"> large misses (RMSE); R² shows share of variation explained</w:t>
+              <w:t>Penalise large misses (RMSE); R² shows share of variation explained</w:t>
             </w:r>
           </w:p>
         </w:tc>
@@ -18310,21 +17521,7 @@
         <w:rPr>
           <w:b/>
         </w:rPr>
-        <w:t xml:space="preserve">Steady </w:t>
-      </w:r>
-      <w:proofErr w:type="spellStart"/>
-      <w:r>
-        <w:rPr>
-          <w:b/>
-        </w:rPr>
-        <w:t>neighbourhood</w:t>
-      </w:r>
-      <w:proofErr w:type="spellEnd"/>
-      <w:r>
-        <w:rPr>
-          <w:b/>
-        </w:rPr>
-        <w:t xml:space="preserve"> stores</w:t>
+        <w:t>Steady neighbourhood stores</w:t>
       </w:r>
       <w:r>
         <w:t xml:space="preserve"> (321) are close to the average on every trait. The practical message is that one promotion plan or one safety buffer does not fit all stores.</w:t>
@@ -21201,21 +20398,7 @@
               <w:rPr>
                 <w:sz w:val="19"/>
               </w:rPr>
-              <w:t xml:space="preserve">B. </w:t>
-            </w:r>
-            <w:proofErr w:type="spellStart"/>
-            <w:r>
-              <w:rPr>
-                <w:sz w:val="19"/>
-              </w:rPr>
-              <w:t>DemandIQ</w:t>
-            </w:r>
-            <w:proofErr w:type="spellEnd"/>
-            <w:r>
-              <w:rPr>
-                <w:sz w:val="19"/>
-              </w:rPr>
-              <w:t xml:space="preserve"> forecast</w:t>
+              <w:t>B. DemandIQ forecast</w:t>
             </w:r>
           </w:p>
         </w:tc>
@@ -21345,29 +20528,49 @@
                 <w:b/>
                 <w:sz w:val="19"/>
               </w:rPr>
-              <w:t xml:space="preserve">C. </w:t>
-            </w:r>
-            <w:proofErr w:type="spellStart"/>
+              <w:t>C. DemandIQ + risk alerts</w:t>
+            </w:r>
+          </w:p>
+        </w:tc>
+        <w:tc>
+          <w:tcPr>
+            <w:tcW w:w="1251" w:type="dxa"/>
+          </w:tcPr>
+          <w:p>
+            <w:pPr>
+              <w:spacing w:after="0"/>
+              <w:jc w:val="center"/>
+            </w:pPr>
             <w:r>
               <w:rPr>
                 <w:b/>
                 <w:sz w:val="19"/>
               </w:rPr>
-              <w:t>DemandIQ</w:t>
-            </w:r>
-            <w:proofErr w:type="spellEnd"/>
+              <w:t>1.50%</w:t>
+            </w:r>
+          </w:p>
+        </w:tc>
+        <w:tc>
+          <w:tcPr>
+            <w:tcW w:w="1104" w:type="dxa"/>
+          </w:tcPr>
+          <w:p>
+            <w:pPr>
+              <w:spacing w:after="0"/>
+              <w:jc w:val="center"/>
+            </w:pPr>
             <w:r>
               <w:rPr>
                 <w:b/>
                 <w:sz w:val="19"/>
               </w:rPr>
-              <w:t xml:space="preserve"> + risk alerts</w:t>
-            </w:r>
-          </w:p>
-        </w:tc>
-        <w:tc>
-          <w:tcPr>
-            <w:tcW w:w="1251" w:type="dxa"/>
+              <w:t>99.58%</w:t>
+            </w:r>
+          </w:p>
+        </w:tc>
+        <w:tc>
+          <w:tcPr>
+            <w:tcW w:w="1177" w:type="dxa"/>
           </w:tcPr>
           <w:p>
             <w:pPr>
@@ -21379,13 +20582,13 @@
                 <w:b/>
                 <w:sz w:val="19"/>
               </w:rPr>
-              <w:t>1.50%</w:t>
-            </w:r>
-          </w:p>
-        </w:tc>
-        <w:tc>
-          <w:tcPr>
-            <w:tcW w:w="1104" w:type="dxa"/>
+              <w:t>2.32</w:t>
+            </w:r>
+          </w:p>
+        </w:tc>
+        <w:tc>
+          <w:tcPr>
+            <w:tcW w:w="1251" w:type="dxa"/>
           </w:tcPr>
           <w:p>
             <w:pPr>
@@ -21397,13 +20600,13 @@
                 <w:b/>
                 <w:sz w:val="19"/>
               </w:rPr>
-              <w:t>99.58%</w:t>
-            </w:r>
-          </w:p>
-        </w:tc>
-        <w:tc>
-          <w:tcPr>
-            <w:tcW w:w="1177" w:type="dxa"/>
+              <w:t>2,380</w:t>
+            </w:r>
+          </w:p>
+        </w:tc>
+        <w:tc>
+          <w:tcPr>
+            <w:tcW w:w="1104" w:type="dxa"/>
           </w:tcPr>
           <w:p>
             <w:pPr>
@@ -21415,13 +20618,13 @@
                 <w:b/>
                 <w:sz w:val="19"/>
               </w:rPr>
-              <w:t>2.32</w:t>
-            </w:r>
-          </w:p>
-        </w:tc>
-        <w:tc>
-          <w:tcPr>
-            <w:tcW w:w="1251" w:type="dxa"/>
+              <w:t>1.69</w:t>
+            </w:r>
+          </w:p>
+        </w:tc>
+        <w:tc>
+          <w:tcPr>
+            <w:tcW w:w="883" w:type="dxa"/>
           </w:tcPr>
           <w:p>
             <w:pPr>
@@ -21433,42 +20636,6 @@
                 <w:b/>
                 <w:sz w:val="19"/>
               </w:rPr>
-              <w:t>2,380</w:t>
-            </w:r>
-          </w:p>
-        </w:tc>
-        <w:tc>
-          <w:tcPr>
-            <w:tcW w:w="1104" w:type="dxa"/>
-          </w:tcPr>
-          <w:p>
-            <w:pPr>
-              <w:spacing w:after="0"/>
-              <w:jc w:val="center"/>
-            </w:pPr>
-            <w:r>
-              <w:rPr>
-                <w:b/>
-                <w:sz w:val="19"/>
-              </w:rPr>
-              <w:t>1.69</w:t>
-            </w:r>
-          </w:p>
-        </w:tc>
-        <w:tc>
-          <w:tcPr>
-            <w:tcW w:w="883" w:type="dxa"/>
-          </w:tcPr>
-          <w:p>
-            <w:pPr>
-              <w:spacing w:after="0"/>
-              <w:jc w:val="center"/>
-            </w:pPr>
-            <w:r>
-              <w:rPr>
-                <w:b/>
-                <w:sz w:val="19"/>
-              </w:rPr>
               <w:t>-63.4%</w:t>
             </w:r>
           </w:p>
@@ -21485,15 +20652,7 @@
         <w:jc w:val="both"/>
       </w:pPr>
       <w:r>
-        <w:t xml:space="preserve">Table 16 and Fig. 15 give the result that matters most. Feeding the ML forecast into a standard order-up-to rule (policy B) cuts stockout days from 7.51% to 2.66% and raises the fill rate to 98.82%. Adding risk-triggered emergency orders (policy C) brings stockout days down to 1.50%, </w:t>
-      </w:r>
-      <w:proofErr w:type="gramStart"/>
-      <w:r>
-        <w:t>a</w:t>
-      </w:r>
-      <w:proofErr w:type="gramEnd"/>
-      <w:r>
-        <w:t xml:space="preserve"> 80% reduction, and total cost falls by 63%. The extra stock needed is modest (1.93 to 2.32 days of sales), and the cost breakdown (Fig. 16) shows that lost margin, not holding, dominates the manager's cost.</w:t>
+        <w:t>Table 16 and Fig. 15 give the result that matters most. Feeding the ML forecast into a standard order-up-to rule (policy B) cuts stockout days from 7.51% to 2.66% and raises the fill rate to 98.82%. Adding risk-triggered emergency orders (policy C) brings stockout days down to 1.50%, a 80% reduction, and total cost falls by 63%. The extra stock needed is modest (1.93 to 2.32 days of sales), and the cost breakdown (Fig. 16) shows that lost margin, not holding, dominates the manager's cost.</w:t>
       </w:r>
     </w:p>
     <w:p>
@@ -21651,15 +20810,7 @@
         <w:t>Is this only "more stock"?</w:t>
       </w:r>
       <w:r>
-        <w:t xml:space="preserve"> A fair critic could say the manager would also do better with a bigger buffer. Fig. 17 answers this by replaying each policy at many settings. For every level of stock held, the </w:t>
-      </w:r>
-      <w:proofErr w:type="spellStart"/>
-      <w:r>
-        <w:t>DemandIQ</w:t>
-      </w:r>
-      <w:proofErr w:type="spellEnd"/>
-      <w:r>
-        <w:t xml:space="preserve"> curve lies below the manager's curve: the same stock is simply placed on the right days (before promotions and holidays). The gap closes only when both hold so much stock that shelf capacity becomes the limit. This addresses gap G3: the benefit comes from better decisions, not just from a lower forecast error.</w:t>
+        <w:t xml:space="preserve"> A fair critic could say the manager would also do better with a bigger buffer. Fig. 17 answers this by replaying each policy at many settings. For every level of stock held, the DemandIQ curve lies below the manager's curve: the same stock is simply placed on the right days (before promotions and holidays). The gap closes only when both hold so much stock that shelf capacity becomes the limit. This addresses gap G3: the benefit comes from better decisions, not just from a lower forecast error.</w:t>
       </w:r>
     </w:p>
     <w:p>
@@ -21756,23 +20907,7 @@
         <w:jc w:val="both"/>
       </w:pPr>
       <w:r>
-        <w:t xml:space="preserve">SHAP values were computed exactly with </w:t>
-      </w:r>
-      <w:proofErr w:type="spellStart"/>
-      <w:r>
-        <w:t>TreeSHAP</w:t>
-      </w:r>
-      <w:proofErr w:type="spellEnd"/>
-      <w:r>
-        <w:t xml:space="preserve"> [39]; the contributions add up to the model output for every row (largest difference 3.0e-14). Globally (Fig. 18), the strongest drivers of the demand forecast are store's usual sales for this weekday, promotion today, avg. sales, 4 weeks ago window and day of month. The </w:t>
-      </w:r>
-      <w:proofErr w:type="spellStart"/>
-      <w:r>
-        <w:t>beeswarm</w:t>
-      </w:r>
-      <w:proofErr w:type="spellEnd"/>
-      <w:r>
-        <w:t xml:space="preserve"> view in Appendix D shows the direction: promotion days push the forecast up, stores with high usual weekday sales get high forecasts, and the start of the month and the day after a closure carry extra demand.</w:t>
+        <w:t>SHAP values were computed exactly with TreeSHAP [39]; the contributions add up to the model output for every row (largest difference 3.0e-14). Globally (Fig. 18), the strongest drivers of the demand forecast are store's usual sales for this weekday, promotion today, avg. sales, 4 weeks ago window and day of month. The beeswarm view in Appendix D shows the direction: promotion days push the forecast up, stores with high usual weekday sales get high forecasts, and the start of the month and the day after a closure carry extra demand.</w:t>
       </w:r>
     </w:p>
     <w:p>
@@ -22013,15 +21148,7 @@
         <w:jc w:val="both"/>
       </w:pPr>
       <w:r>
-        <w:t>For the risk model (Fig. 21) the most important inputs are cover ratio (</w:t>
-      </w:r>
-      <w:proofErr w:type="spellStart"/>
-      <w:r>
-        <w:t>stock+due</w:t>
-      </w:r>
-      <w:proofErr w:type="spellEnd"/>
-      <w:r>
-        <w:t xml:space="preserve"> / forecast), stock on hand (days) and promotion days ahead, in line with Liu et al. [31]. Low cover and an upcoming promotion raise risk; a delivery due in the next three days lowers it. Because explanations exist for the risk score too, the manager sees not only that a store is HIGH risk but why, which answers gap G2.</w:t>
+        <w:t>For the risk model (Fig. 21) the most important inputs are cover ratio (stock+due / forecast), stock on hand (days) and promotion days ahead, in line with Liu et al. [31]. Low cover and an upcoming promotion raise risk; a delivery due in the next three days lowers it. Because explanations exist for the risk score too, the manager sees not only that a store is HIGH risk but why, which answers gap G2.</w:t>
       </w:r>
     </w:p>
     <w:p>
@@ -22118,15 +21245,7 @@
         <w:jc w:val="both"/>
       </w:pPr>
       <w:r>
-        <w:t xml:space="preserve">The </w:t>
-      </w:r>
-      <w:proofErr w:type="spellStart"/>
-      <w:r>
-        <w:t>Streamlit</w:t>
-      </w:r>
-      <w:proofErr w:type="spellEnd"/>
-      <w:r>
-        <w:t xml:space="preserve"> dashboard has six pages: an overview of results; a store forecast page with the P10-P90 band; a ranked risk and reorder list with an order calculator; a "Why this forecast?" page with the SHAP waterfall and a plain-language summary; a what-if simulator (promotion, school holiday, closure, competitor distance and price with a user-set elasticity); and the store segments. Every what-if screen carries the warning that the result is model behaviour, not proof of cause and effect. Screenshots are given in Appendix C.</w:t>
+        <w:t>The Streamlit dashboard has six pages: an overview of results; a store forecast page with the P10-P90 band; a ranked risk and reorder list with an order calculator; a "Why this forecast?" page with the SHAP waterfall and a plain-language summary; a what-if simulator (promotion, school holiday, closure, competitor distance and price with a user-set elasticity); and the store segments. Every what-if screen carries the warning that the result is model behaviour, not proof of cause and effect. Screenshots are given in Appendix C.</w:t>
       </w:r>
     </w:p>
     <w:p>
@@ -22171,19 +21290,11 @@
         </w:rPr>
         <w:t xml:space="preserve">Table 17. </w:t>
       </w:r>
-      <w:proofErr w:type="spellStart"/>
       <w:r>
         <w:rPr>
           <w:color w:val="auto"/>
         </w:rPr>
-        <w:t>DemandIQ</w:t>
-      </w:r>
-      <w:proofErr w:type="spellEnd"/>
-      <w:r>
-        <w:rPr>
-          <w:color w:val="auto"/>
-        </w:rPr>
-        <w:t xml:space="preserve"> compared with related work</w:t>
+        <w:t>DemandIQ compared with related work</w:t>
       </w:r>
       <w:bookmarkEnd w:id="74"/>
     </w:p>
@@ -22271,7 +21382,6 @@
               <w:spacing w:after="0"/>
               <w:jc w:val="center"/>
             </w:pPr>
-            <w:proofErr w:type="spellStart"/>
             <w:r>
               <w:rPr>
                 <w:b/>
@@ -22279,7 +21389,6 @@
               </w:rPr>
               <w:t>DemandIQ</w:t>
             </w:r>
-            <w:proofErr w:type="spellEnd"/>
           </w:p>
         </w:tc>
       </w:tr>
@@ -22373,21 +21482,7 @@
               <w:rPr>
                 <w:sz w:val="18"/>
               </w:rPr>
-              <w:t xml:space="preserve">Huber &amp; </w:t>
-            </w:r>
-            <w:proofErr w:type="spellStart"/>
-            <w:r>
-              <w:rPr>
-                <w:sz w:val="18"/>
-              </w:rPr>
-              <w:t>Stuckenschmidt</w:t>
-            </w:r>
-            <w:proofErr w:type="spellEnd"/>
-            <w:r>
-              <w:rPr>
-                <w:sz w:val="18"/>
-              </w:rPr>
-              <w:t xml:space="preserve"> [28]</w:t>
+              <w:t>Huber &amp; Stuckenschmidt [28]</w:t>
             </w:r>
           </w:p>
         </w:tc>
@@ -22731,15 +21826,7 @@
         <w:t>No price data.</w:t>
       </w:r>
       <w:r>
-        <w:t xml:space="preserve"> The price lever uses an assumed elasticity (default -1.5, adjustable). </w:t>
-      </w:r>
-      <w:proofErr w:type="spellStart"/>
-      <w:r>
-        <w:t>Bijmolt</w:t>
-      </w:r>
-      <w:proofErr w:type="spellEnd"/>
-      <w:r>
-        <w:t xml:space="preserve"> et al. report an average brand-level elasticity of about -2.6 [46]; whole-store demand is usually less elastic.</w:t>
+        <w:t xml:space="preserve"> The price lever uses an assumed elasticity (default -1.5, adjustable). Bijmolt et al. report an average brand-level elasticity of about -2.6 [46]; whole-store demand is usually less elastic.</w:t>
       </w:r>
     </w:p>
     <w:p>
@@ -22839,13 +21926,8 @@
       <w:pPr>
         <w:jc w:val="both"/>
       </w:pPr>
-      <w:proofErr w:type="spellStart"/>
-      <w:r>
-        <w:t>DemandIQ</w:t>
-      </w:r>
-      <w:proofErr w:type="spellEnd"/>
-      <w:r>
-        <w:t xml:space="preserve"> shows that a small set of classical machine-learning models, chained together, can take a retailer from raw sales history to an explained ordering decision. Against the objectives set in Section 2.3:</w:t>
+      <w:r>
+        <w:t>DemandIQ shows that a small set of classical machine-learning models, chained together, can take a retailer from raw sales history to an explained ordering decision. Against the objectives set in Section 2.3:</w:t>
       </w:r>
     </w:p>
     <w:p>
@@ -23312,21 +22394,7 @@
               <w:rPr>
                 <w:sz w:val="20"/>
               </w:rPr>
-              <w:t xml:space="preserve">Exact </w:t>
-            </w:r>
-            <w:proofErr w:type="spellStart"/>
-            <w:r>
-              <w:rPr>
-                <w:sz w:val="20"/>
-              </w:rPr>
-              <w:t>TreeSHAP</w:t>
-            </w:r>
-            <w:proofErr w:type="spellEnd"/>
-            <w:r>
-              <w:rPr>
-                <w:sz w:val="20"/>
-              </w:rPr>
-              <w:t xml:space="preserve"> for both models; 6-page dashboard</w:t>
+              <w:t>Exact TreeSHAP for both models; 6-page dashboard</w:t>
             </w:r>
           </w:p>
         </w:tc>
@@ -23535,15 +22603,7 @@
         <w:t>Deployment.</w:t>
       </w:r>
       <w:r>
-        <w:t xml:space="preserve"> Schedule the pipeline to retrain weekly, send the </w:t>
-      </w:r>
-      <w:proofErr w:type="spellStart"/>
-      <w:r>
-        <w:t>HIGH-risk</w:t>
-      </w:r>
-      <w:proofErr w:type="spellEnd"/>
-      <w:r>
-        <w:t xml:space="preserve"> list to managers each evening, and log their decisions to measure real impact.</w:t>
+        <w:t xml:space="preserve"> Schedule the pipeline to retrain weekly, send the HIGH-risk list to managers each evening, and log their decisions to measure real impact.</w:t>
       </w:r>
     </w:p>
     <w:p/>
@@ -23675,35 +22735,7 @@
           <w:sz w:val="21"/>
         </w:rPr>
         <w:tab/>
-        <w:t xml:space="preserve">S. </w:t>
-      </w:r>
-      <w:proofErr w:type="spellStart"/>
-      <w:r>
-        <w:rPr>
-          <w:sz w:val="21"/>
-        </w:rPr>
-        <w:t>Makridakis</w:t>
-      </w:r>
-      <w:proofErr w:type="spellEnd"/>
-      <w:r>
-        <w:rPr>
-          <w:sz w:val="21"/>
-        </w:rPr>
-        <w:t xml:space="preserve">, E. Spiliotis, and V. </w:t>
-      </w:r>
-      <w:proofErr w:type="spellStart"/>
-      <w:r>
-        <w:rPr>
-          <w:sz w:val="21"/>
-        </w:rPr>
-        <w:t>Assimakopoulos</w:t>
-      </w:r>
-      <w:proofErr w:type="spellEnd"/>
-      <w:r>
-        <w:rPr>
-          <w:sz w:val="21"/>
-        </w:rPr>
-        <w:t xml:space="preserve">, "M5 accuracy competition: Results, findings, and conclusions," </w:t>
+        <w:t xml:space="preserve">S. Makridakis, E. Spiliotis, and V. Assimakopoulos, "M5 accuracy competition: Results, findings, and conclusions," </w:t>
       </w:r>
       <w:r>
         <w:rPr>
@@ -23716,21 +22748,7 @@
         <w:rPr>
           <w:sz w:val="21"/>
         </w:rPr>
-        <w:t xml:space="preserve">, vol. 38, no. 4, pp. 1346-1364, 2022, </w:t>
-      </w:r>
-      <w:proofErr w:type="spellStart"/>
-      <w:r>
-        <w:rPr>
-          <w:sz w:val="21"/>
-        </w:rPr>
-        <w:t>doi</w:t>
-      </w:r>
-      <w:proofErr w:type="spellEnd"/>
-      <w:r>
-        <w:rPr>
-          <w:sz w:val="21"/>
-        </w:rPr>
-        <w:t>: 10.1016/j.ijforecast.2021.11.013.</w:t>
+        <w:t>, vol. 38, no. 4, pp. 1346-1364, 2022, doi: 10.1016/j.ijforecast.2021.11.013.</w:t>
       </w:r>
     </w:p>
     <w:p>
@@ -23845,21 +22863,7 @@
         <w:rPr>
           <w:sz w:val="21"/>
         </w:rPr>
-        <w:t xml:space="preserve">, 3rd ed. Melbourne, Australia: </w:t>
-      </w:r>
-      <w:proofErr w:type="spellStart"/>
-      <w:r>
-        <w:rPr>
-          <w:sz w:val="21"/>
-        </w:rPr>
-        <w:t>OTexts</w:t>
-      </w:r>
-      <w:proofErr w:type="spellEnd"/>
-      <w:r>
-        <w:rPr>
-          <w:sz w:val="21"/>
-        </w:rPr>
-        <w:t>, 2021.</w:t>
+        <w:t>, 3rd ed. Melbourne, Australia: OTexts, 2021.</w:t>
       </w:r>
     </w:p>
     <w:p>
@@ -24006,21 +23010,7 @@
           <w:sz w:val="21"/>
         </w:rPr>
         <w:tab/>
-        <w:t xml:space="preserve">S. </w:t>
-      </w:r>
-      <w:proofErr w:type="spellStart"/>
-      <w:r>
-        <w:rPr>
-          <w:sz w:val="21"/>
-        </w:rPr>
-        <w:t>Axsäter</w:t>
-      </w:r>
-      <w:proofErr w:type="spellEnd"/>
-      <w:r>
-        <w:rPr>
-          <w:sz w:val="21"/>
-        </w:rPr>
-        <w:t xml:space="preserve">, </w:t>
+        <w:t xml:space="preserve">S. Axsäter, </w:t>
       </w:r>
       <w:r>
         <w:rPr>
@@ -24084,21 +23074,7 @@
           <w:sz w:val="21"/>
         </w:rPr>
         <w:tab/>
-        <w:t xml:space="preserve">T. Hastie, R. </w:t>
-      </w:r>
-      <w:proofErr w:type="spellStart"/>
-      <w:r>
-        <w:rPr>
-          <w:sz w:val="21"/>
-        </w:rPr>
-        <w:t>Tibshirani</w:t>
-      </w:r>
-      <w:proofErr w:type="spellEnd"/>
-      <w:r>
-        <w:rPr>
-          <w:sz w:val="21"/>
-        </w:rPr>
-        <w:t xml:space="preserve">, and J. Friedman, </w:t>
+        <w:t xml:space="preserve">T. Hastie, R. Tibshirani, and J. Friedman, </w:t>
       </w:r>
       <w:r>
         <w:rPr>
@@ -24130,21 +23106,7 @@
           <w:sz w:val="21"/>
         </w:rPr>
         <w:tab/>
-        <w:t xml:space="preserve">G. James, D. Witten, T. Hastie, and R. </w:t>
-      </w:r>
-      <w:proofErr w:type="spellStart"/>
-      <w:r>
-        <w:rPr>
-          <w:sz w:val="21"/>
-        </w:rPr>
-        <w:t>Tibshirani</w:t>
-      </w:r>
-      <w:proofErr w:type="spellEnd"/>
-      <w:r>
-        <w:rPr>
-          <w:sz w:val="21"/>
-        </w:rPr>
-        <w:t xml:space="preserve">, </w:t>
+        <w:t xml:space="preserve">G. James, D. Witten, T. Hastie, and R. Tibshirani, </w:t>
       </w:r>
       <w:r>
         <w:rPr>
@@ -24240,50 +23202,84 @@
           <w:sz w:val="21"/>
         </w:rPr>
         <w:tab/>
-        <w:t xml:space="preserve">A. </w:t>
-      </w:r>
-      <w:proofErr w:type="spellStart"/>
-      <w:r>
-        <w:rPr>
-          <w:sz w:val="21"/>
-        </w:rPr>
-        <w:t>Géron</w:t>
-      </w:r>
-      <w:proofErr w:type="spellEnd"/>
-      <w:r>
-        <w:rPr>
-          <w:sz w:val="21"/>
-        </w:rPr>
-        <w:t xml:space="preserve">, </w:t>
+        <w:t xml:space="preserve">A. Géron, </w:t>
       </w:r>
       <w:r>
         <w:rPr>
           <w:i/>
           <w:sz w:val="21"/>
         </w:rPr>
-        <w:t xml:space="preserve">Hands-On Machine Learning with Scikit-Learn, </w:t>
-      </w:r>
-      <w:proofErr w:type="spellStart"/>
+        <w:t>Hands-On Machine Learning with Scikit-Learn, Keras, and TensorFlow</w:t>
+      </w:r>
+      <w:r>
+        <w:rPr>
+          <w:sz w:val="21"/>
+        </w:rPr>
+        <w:t>, 3rd ed. Sebastopol, CA, USA: O'Reilly Media, 2022.</w:t>
+      </w:r>
+    </w:p>
+    <w:p>
+      <w:pPr>
+        <w:spacing w:after="60"/>
+        <w:ind w:left="648" w:hanging="648"/>
+      </w:pPr>
+      <w:r>
+        <w:rPr>
+          <w:sz w:val="21"/>
+        </w:rPr>
+        <w:t>[19]</w:t>
+      </w:r>
+      <w:r>
+        <w:rPr>
+          <w:sz w:val="21"/>
+        </w:rPr>
+        <w:tab/>
+        <w:t xml:space="preserve">M. Kuhn and K. Johnson, </w:t>
+      </w:r>
       <w:r>
         <w:rPr>
           <w:i/>
           <w:sz w:val="21"/>
         </w:rPr>
-        <w:t>Keras</w:t>
-      </w:r>
-      <w:proofErr w:type="spellEnd"/>
+        <w:t>Applied Predictive Modeling</w:t>
+      </w:r>
+      <w:r>
+        <w:rPr>
+          <w:sz w:val="21"/>
+        </w:rPr>
+        <w:t>. New York, NY, USA: Springer, 2013.</w:t>
+      </w:r>
+    </w:p>
+    <w:p>
+      <w:pPr>
+        <w:spacing w:after="60"/>
+        <w:ind w:left="648" w:hanging="648"/>
+      </w:pPr>
+      <w:r>
+        <w:rPr>
+          <w:sz w:val="21"/>
+        </w:rPr>
+        <w:t>[20]</w:t>
+      </w:r>
+      <w:r>
+        <w:rPr>
+          <w:sz w:val="21"/>
+        </w:rPr>
+        <w:tab/>
+        <w:t xml:space="preserve">M. Kuhn and K. Johnson, </w:t>
+      </w:r>
       <w:r>
         <w:rPr>
           <w:i/>
           <w:sz w:val="21"/>
         </w:rPr>
-        <w:t>, and TensorFlow</w:t>
+        <w:t>Feature Engineering and Selection: A Practical Approach for Predictive Models</w:t>
       </w:r>
       <w:r>
         <w:rPr>
           <w:sz w:val="21"/>
         </w:rPr>
-        <w:t>, 3rd ed. Sebastopol, CA, USA: O'Reilly Media, 2022.</w:t>
+        <w:t>. Boca Raton, FL, USA: CRC Press, 2019.</w:t>
       </w:r>
     </w:p>
     <w:p>
@@ -24295,27 +23291,27 @@
         <w:rPr>
           <w:sz w:val="21"/>
         </w:rPr>
-        <w:t>[19]</w:t>
+        <w:t>[21]</w:t>
       </w:r>
       <w:r>
         <w:rPr>
           <w:sz w:val="21"/>
         </w:rPr>
         <w:tab/>
-        <w:t xml:space="preserve">M. Kuhn and K. Johnson, </w:t>
+        <w:t xml:space="preserve">H. He and Y. Ma, Eds., </w:t>
       </w:r>
       <w:r>
         <w:rPr>
           <w:i/>
           <w:sz w:val="21"/>
         </w:rPr>
-        <w:t>Applied Predictive Modeling</w:t>
+        <w:t>Imbalanced Learning: Foundations, Algorithms, and Applications</w:t>
       </w:r>
       <w:r>
         <w:rPr>
           <w:sz w:val="21"/>
         </w:rPr>
-        <w:t>. New York, NY, USA: Springer, 2013.</w:t>
+        <w:t>. Hoboken, NJ, USA: Wiley-IEEE Press, 2013.</w:t>
       </w:r>
     </w:p>
     <w:p>
@@ -24327,27 +23323,27 @@
         <w:rPr>
           <w:sz w:val="21"/>
         </w:rPr>
-        <w:t>[20]</w:t>
+        <w:t>[22]</w:t>
       </w:r>
       <w:r>
         <w:rPr>
           <w:sz w:val="21"/>
         </w:rPr>
         <w:tab/>
-        <w:t xml:space="preserve">M. Kuhn and K. Johnson, </w:t>
+        <w:t xml:space="preserve">C. Molnar, </w:t>
       </w:r>
       <w:r>
         <w:rPr>
           <w:i/>
           <w:sz w:val="21"/>
         </w:rPr>
-        <w:t>Feature Engineering and Selection: A Practical Approach for Predictive Models</w:t>
+        <w:t>Interpretable Machine Learning: A Guide for Making Black Box Models Explainable</w:t>
       </w:r>
       <w:r>
         <w:rPr>
           <w:sz w:val="21"/>
         </w:rPr>
-        <w:t>. Boca Raton, FL, USA: CRC Press, 2019.</w:t>
+        <w:t>, 2nd ed. 2022. [Online]. Available: https://christophm.github.io/interpretable-ml-book/</w:t>
       </w:r>
     </w:p>
     <w:p>
@@ -24359,27 +23355,27 @@
         <w:rPr>
           <w:sz w:val="21"/>
         </w:rPr>
-        <w:t>[21]</w:t>
+        <w:t>[23]</w:t>
       </w:r>
       <w:r>
         <w:rPr>
           <w:sz w:val="21"/>
         </w:rPr>
         <w:tab/>
-        <w:t xml:space="preserve">H. He and Y. Ma, Eds., </w:t>
+        <w:t xml:space="preserve">J. Pearl, M. Glymour, and N. P. Jewell, </w:t>
       </w:r>
       <w:r>
         <w:rPr>
           <w:i/>
           <w:sz w:val="21"/>
         </w:rPr>
-        <w:t>Imbalanced Learning: Foundations, Algorithms, and Applications</w:t>
+        <w:t>Causal Inference in Statistics: A Primer</w:t>
       </w:r>
       <w:r>
         <w:rPr>
           <w:sz w:val="21"/>
         </w:rPr>
-        <w:t>. Hoboken, NJ, USA: Wiley-IEEE Press, 2013.</w:t>
+        <w:t>. Chichester, U.K.: Wiley, 2016.</w:t>
       </w:r>
     </w:p>
     <w:p>
@@ -24391,27 +23387,27 @@
         <w:rPr>
           <w:sz w:val="21"/>
         </w:rPr>
-        <w:t>[22]</w:t>
+        <w:t>[24]</w:t>
       </w:r>
       <w:r>
         <w:rPr>
           <w:sz w:val="21"/>
         </w:rPr>
         <w:tab/>
-        <w:t xml:space="preserve">C. Molnar, </w:t>
+        <w:t xml:space="preserve">F. Provost and T. Fawcett, </w:t>
       </w:r>
       <w:r>
         <w:rPr>
           <w:i/>
           <w:sz w:val="21"/>
         </w:rPr>
-        <w:t>Interpretable Machine Learning: A Guide for Making Black Box Models Explainable</w:t>
+        <w:t>Data Science for Business</w:t>
       </w:r>
       <w:r>
         <w:rPr>
           <w:sz w:val="21"/>
         </w:rPr>
-        <w:t>, 2nd ed. 2022. [Online]. Available: https://christophm.github.io/interpretable-ml-book/</w:t>
+        <w:t>. Sebastopol, CA, USA: O'Reilly Media, 2013.</w:t>
       </w:r>
     </w:p>
     <w:p>
@@ -24423,41 +23419,28 @@
         <w:rPr>
           <w:sz w:val="21"/>
         </w:rPr>
-        <w:t>[23]</w:t>
+        <w:lastRenderedPageBreak/>
+        <w:t>[25]</w:t>
       </w:r>
       <w:r>
         <w:rPr>
           <w:sz w:val="21"/>
         </w:rPr>
         <w:tab/>
-        <w:t xml:space="preserve">J. Pearl, M. </w:t>
-      </w:r>
-      <w:proofErr w:type="spellStart"/>
-      <w:r>
-        <w:rPr>
-          <w:sz w:val="21"/>
-        </w:rPr>
-        <w:t>Glymour</w:t>
-      </w:r>
-      <w:proofErr w:type="spellEnd"/>
-      <w:r>
-        <w:rPr>
-          <w:sz w:val="21"/>
-        </w:rPr>
-        <w:t xml:space="preserve">, and N. P. Jewell, </w:t>
+        <w:t xml:space="preserve">M. Seyedan and F. Mafakheri, "Predictive big data analytics for supply chain demand forecasting: Methods, applications, and research opportunities," </w:t>
       </w:r>
       <w:r>
         <w:rPr>
           <w:i/>
           <w:sz w:val="21"/>
         </w:rPr>
-        <w:t>Causal Inference in Statistics: A Primer</w:t>
+        <w:t>J. Big Data</w:t>
       </w:r>
       <w:r>
         <w:rPr>
           <w:sz w:val="21"/>
         </w:rPr>
-        <w:t>. Chichester, U.K.: Wiley, 2016.</w:t>
+        <w:t>, vol. 7, Art. no. 53, 2020, doi: 10.1186/s40537-020-00329-2.</w:t>
       </w:r>
     </w:p>
     <w:p>
@@ -24469,27 +23452,27 @@
         <w:rPr>
           <w:sz w:val="21"/>
         </w:rPr>
-        <w:t>[24]</w:t>
+        <w:t>[26]</w:t>
       </w:r>
       <w:r>
         <w:rPr>
           <w:sz w:val="21"/>
         </w:rPr>
         <w:tab/>
-        <w:t xml:space="preserve">F. Provost and T. Fawcett, </w:t>
+        <w:t xml:space="preserve">G. Ke, Q. Meng, T. Finley, T. Wang, W. Chen, W. Ma, Q. Ye, and T.-Y. Liu, "LightGBM: A highly efficient gradient boosting decision tree," in </w:t>
       </w:r>
       <w:r>
         <w:rPr>
           <w:i/>
           <w:sz w:val="21"/>
         </w:rPr>
-        <w:t>Data Science for Business</w:t>
+        <w:t>Proc. Adv. Neural Inf. Process. Syst. (NIPS)</w:t>
       </w:r>
       <w:r>
         <w:rPr>
           <w:sz w:val="21"/>
         </w:rPr>
-        <w:t>. Sebastopol, CA, USA: O'Reilly Media, 2013.</w:t>
+        <w:t>, vol. 30, 2017, pp. 3146-3154.</w:t>
       </w:r>
     </w:p>
     <w:p>
@@ -24501,70 +23484,27 @@
         <w:rPr>
           <w:sz w:val="21"/>
         </w:rPr>
-        <w:lastRenderedPageBreak/>
-        <w:t>[25]</w:t>
+        <w:t>[27]</w:t>
       </w:r>
       <w:r>
         <w:rPr>
           <w:sz w:val="21"/>
         </w:rPr>
         <w:tab/>
-        <w:t xml:space="preserve">M. </w:t>
-      </w:r>
-      <w:proofErr w:type="spellStart"/>
-      <w:r>
-        <w:rPr>
-          <w:sz w:val="21"/>
-        </w:rPr>
-        <w:t>Seyedan</w:t>
-      </w:r>
-      <w:proofErr w:type="spellEnd"/>
-      <w:r>
-        <w:rPr>
-          <w:sz w:val="21"/>
-        </w:rPr>
-        <w:t xml:space="preserve"> and F. </w:t>
-      </w:r>
-      <w:proofErr w:type="spellStart"/>
-      <w:r>
-        <w:rPr>
-          <w:sz w:val="21"/>
-        </w:rPr>
-        <w:t>Mafakheri</w:t>
-      </w:r>
-      <w:proofErr w:type="spellEnd"/>
-      <w:r>
-        <w:rPr>
-          <w:sz w:val="21"/>
-        </w:rPr>
-        <w:t xml:space="preserve">, "Predictive big data analytics for supply chain demand forecasting: Methods, applications, and research opportunities," </w:t>
+        <w:t xml:space="preserve">Ö. Gür Ali, S. Sayın, T. van Woensel, and J. Fransoo, "SKU demand forecasting in the presence of promotions," </w:t>
       </w:r>
       <w:r>
         <w:rPr>
           <w:i/>
           <w:sz w:val="21"/>
         </w:rPr>
-        <w:t>J. Big Data</w:t>
+        <w:t>Expert Syst. Appl.</w:t>
       </w:r>
       <w:r>
         <w:rPr>
           <w:sz w:val="21"/>
         </w:rPr>
-        <w:t xml:space="preserve">, vol. 7, Art. no. 53, 2020, </w:t>
-      </w:r>
-      <w:proofErr w:type="spellStart"/>
-      <w:r>
-        <w:rPr>
-          <w:sz w:val="21"/>
-        </w:rPr>
-        <w:t>doi</w:t>
-      </w:r>
-      <w:proofErr w:type="spellEnd"/>
-      <w:r>
-        <w:rPr>
-          <w:sz w:val="21"/>
-        </w:rPr>
-        <w:t>: 10.1186/s40537-020-00329-2.</w:t>
+        <w:t>, vol. 36, no. 10, pp. 12340-12348, 2009, doi: 10.1016/j.eswa.2009.04.052.</w:t>
       </w:r>
     </w:p>
     <w:p>
@@ -24576,41 +23516,27 @@
         <w:rPr>
           <w:sz w:val="21"/>
         </w:rPr>
-        <w:t>[26]</w:t>
+        <w:t>[28]</w:t>
       </w:r>
       <w:r>
         <w:rPr>
           <w:sz w:val="21"/>
         </w:rPr>
         <w:tab/>
-        <w:t>G. Ke, Q. Meng, T. Finley, T. Wang, W. Chen, W. Ma, Q. Ye, and T.-Y. Liu, "</w:t>
-      </w:r>
-      <w:proofErr w:type="spellStart"/>
-      <w:r>
-        <w:rPr>
-          <w:sz w:val="21"/>
-        </w:rPr>
-        <w:t>LightGBM</w:t>
-      </w:r>
-      <w:proofErr w:type="spellEnd"/>
-      <w:r>
-        <w:rPr>
-          <w:sz w:val="21"/>
-        </w:rPr>
-        <w:t xml:space="preserve">: A highly efficient gradient boosting decision tree," in </w:t>
+        <w:t xml:space="preserve">J. Huber and H. Stuckenschmidt, "Daily retail demand forecasting using machine learning with emphasis on calendric special days," </w:t>
       </w:r>
       <w:r>
         <w:rPr>
           <w:i/>
           <w:sz w:val="21"/>
         </w:rPr>
-        <w:t>Proc. Adv. Neural Inf. Process. Syst. (NIPS)</w:t>
+        <w:t>Int. J. Forecast.</w:t>
       </w:r>
       <w:r>
         <w:rPr>
           <w:sz w:val="21"/>
         </w:rPr>
-        <w:t>, vol. 30, 2017, pp. 3146-3154.</w:t>
+        <w:t>, vol. 36, no. 4, pp. 1420-1438, 2020, doi: 10.1016/j.ijforecast.2020.02.005.</w:t>
       </w:r>
     </w:p>
     <w:p>
@@ -24622,69 +23548,27 @@
         <w:rPr>
           <w:sz w:val="21"/>
         </w:rPr>
-        <w:t>[27]</w:t>
+        <w:t>[29]</w:t>
       </w:r>
       <w:r>
         <w:rPr>
           <w:sz w:val="21"/>
         </w:rPr>
         <w:tab/>
-        <w:t xml:space="preserve">Ö. Gür Ali, S. Sayın, T. van </w:t>
-      </w:r>
-      <w:proofErr w:type="spellStart"/>
-      <w:r>
-        <w:rPr>
-          <w:sz w:val="21"/>
-        </w:rPr>
-        <w:t>Woensel</w:t>
-      </w:r>
-      <w:proofErr w:type="spellEnd"/>
-      <w:r>
-        <w:rPr>
-          <w:sz w:val="21"/>
-        </w:rPr>
-        <w:t xml:space="preserve">, and J. </w:t>
-      </w:r>
-      <w:proofErr w:type="spellStart"/>
-      <w:r>
-        <w:rPr>
-          <w:sz w:val="21"/>
-        </w:rPr>
-        <w:t>Fransoo</w:t>
-      </w:r>
-      <w:proofErr w:type="spellEnd"/>
-      <w:r>
-        <w:rPr>
-          <w:sz w:val="21"/>
-        </w:rPr>
-        <w:t xml:space="preserve">, "SKU demand forecasting in the presence of promotions," </w:t>
+        <w:t xml:space="preserve">E. Spiliotis, S. Makridakis, A.-A. Semenoglou, and V. Assimakopoulos, "Comparison of statistical and machine learning methods for daily SKU demand forecasting," </w:t>
       </w:r>
       <w:r>
         <w:rPr>
           <w:i/>
           <w:sz w:val="21"/>
         </w:rPr>
-        <w:t>Expert Syst. Appl.</w:t>
+        <w:t>Oper. Res. Int. J.</w:t>
       </w:r>
       <w:r>
         <w:rPr>
           <w:sz w:val="21"/>
         </w:rPr>
-        <w:t xml:space="preserve">, vol. 36, no. 10, pp. 12340-12348, 2009, </w:t>
-      </w:r>
-      <w:proofErr w:type="spellStart"/>
-      <w:r>
-        <w:rPr>
-          <w:sz w:val="21"/>
-        </w:rPr>
-        <w:t>doi</w:t>
-      </w:r>
-      <w:proofErr w:type="spellEnd"/>
-      <w:r>
-        <w:rPr>
-          <w:sz w:val="21"/>
-        </w:rPr>
-        <w:t>: 10.1016/j.eswa.2009.04.052.</w:t>
+        <w:t>, vol. 22, no. 3, pp. 3037-3061, 2022, doi: 10.1007/s12351-020-00605-2.</w:t>
       </w:r>
     </w:p>
     <w:p>
@@ -24696,28 +23580,14 @@
         <w:rPr>
           <w:sz w:val="21"/>
         </w:rPr>
-        <w:t>[28]</w:t>
+        <w:t>[30]</w:t>
       </w:r>
       <w:r>
         <w:rPr>
           <w:sz w:val="21"/>
         </w:rPr>
         <w:tab/>
-        <w:t xml:space="preserve">J. Huber and H. </w:t>
-      </w:r>
-      <w:proofErr w:type="spellStart"/>
-      <w:r>
-        <w:rPr>
-          <w:sz w:val="21"/>
-        </w:rPr>
-        <w:t>Stuckenschmidt</w:t>
-      </w:r>
-      <w:proofErr w:type="spellEnd"/>
-      <w:r>
-        <w:rPr>
-          <w:sz w:val="21"/>
-        </w:rPr>
-        <w:t xml:space="preserve">, "Daily retail demand forecasting using machine learning with emphasis on calendric special days," </w:t>
+        <w:t xml:space="preserve">B. Lim, S. Ö. Arık, N. Loeff, and T. Pfister, "Temporal fusion transformers for interpretable multi-horizon time series forecasting," </w:t>
       </w:r>
       <w:r>
         <w:rPr>
@@ -24730,21 +23600,7 @@
         <w:rPr>
           <w:sz w:val="21"/>
         </w:rPr>
-        <w:t xml:space="preserve">, vol. 36, no. 4, pp. 1420-1438, 2020, </w:t>
-      </w:r>
-      <w:proofErr w:type="spellStart"/>
-      <w:r>
-        <w:rPr>
-          <w:sz w:val="21"/>
-        </w:rPr>
-        <w:t>doi</w:t>
-      </w:r>
-      <w:proofErr w:type="spellEnd"/>
-      <w:r>
-        <w:rPr>
-          <w:sz w:val="21"/>
-        </w:rPr>
-        <w:t>: 10.1016/j.ijforecast.2020.02.005.</w:t>
+        <w:t>, vol. 37, no. 4, pp. 1748-1764, 2021.</w:t>
       </w:r>
     </w:p>
     <w:p>
@@ -24756,69 +23612,27 @@
         <w:rPr>
           <w:sz w:val="21"/>
         </w:rPr>
-        <w:t>[29]</w:t>
+        <w:t>[31]</w:t>
       </w:r>
       <w:r>
         <w:rPr>
           <w:sz w:val="21"/>
         </w:rPr>
         <w:tab/>
-        <w:t xml:space="preserve">E. Spiliotis, S. </w:t>
-      </w:r>
-      <w:proofErr w:type="spellStart"/>
-      <w:r>
-        <w:rPr>
-          <w:sz w:val="21"/>
-        </w:rPr>
-        <w:t>Makridakis</w:t>
-      </w:r>
-      <w:proofErr w:type="spellEnd"/>
-      <w:r>
-        <w:rPr>
-          <w:sz w:val="21"/>
-        </w:rPr>
-        <w:t xml:space="preserve">, A.-A. Semenoglou, and V. </w:t>
-      </w:r>
-      <w:proofErr w:type="spellStart"/>
-      <w:r>
-        <w:rPr>
-          <w:sz w:val="21"/>
-        </w:rPr>
-        <w:t>Assimakopoulos</w:t>
-      </w:r>
-      <w:proofErr w:type="spellEnd"/>
-      <w:r>
-        <w:rPr>
-          <w:sz w:val="21"/>
-        </w:rPr>
-        <w:t xml:space="preserve">, "Comparison of statistical and machine learning methods for daily SKU demand forecasting," </w:t>
+        <w:t xml:space="preserve">Y. Liu, D. Kalaitzi, M. Wang, and C. Papanagnou, "A machine learning approach to inventory stockout prediction," </w:t>
       </w:r>
       <w:r>
         <w:rPr>
           <w:i/>
           <w:sz w:val="21"/>
         </w:rPr>
-        <w:t>Oper. Res. Int. J.</w:t>
+        <w:t>J. Digit. Econ.</w:t>
       </w:r>
       <w:r>
         <w:rPr>
           <w:sz w:val="21"/>
         </w:rPr>
-        <w:t xml:space="preserve">, vol. 22, no. 3, pp. 3037-3061, 2022, </w:t>
-      </w:r>
-      <w:proofErr w:type="spellStart"/>
-      <w:r>
-        <w:rPr>
-          <w:sz w:val="21"/>
-        </w:rPr>
-        <w:t>doi</w:t>
-      </w:r>
-      <w:proofErr w:type="spellEnd"/>
-      <w:r>
-        <w:rPr>
-          <w:sz w:val="21"/>
-        </w:rPr>
-        <w:t>: 10.1007/s12351-020-00605-2.</w:t>
+        <w:t>, vol. 4, pp. 144-155, 2025, doi: 10.1016/j.jdec.2025.06.002.</w:t>
       </w:r>
     </w:p>
     <w:p>
@@ -24830,41 +23644,27 @@
         <w:rPr>
           <w:sz w:val="21"/>
         </w:rPr>
-        <w:t>[30]</w:t>
+        <w:t>[32]</w:t>
       </w:r>
       <w:r>
         <w:rPr>
           <w:sz w:val="21"/>
         </w:rPr>
         <w:tab/>
-        <w:t xml:space="preserve">B. Lim, S. Ö. </w:t>
-      </w:r>
-      <w:proofErr w:type="spellStart"/>
-      <w:r>
-        <w:rPr>
-          <w:sz w:val="21"/>
-        </w:rPr>
-        <w:t>Arık</w:t>
-      </w:r>
-      <w:proofErr w:type="spellEnd"/>
-      <w:r>
-        <w:rPr>
-          <w:sz w:val="21"/>
-        </w:rPr>
-        <w:t xml:space="preserve">, N. Loeff, and T. Pfister, "Temporal fusion transformers for interpretable multi-horizon time series forecasting," </w:t>
+        <w:t xml:space="preserve">E. Theodorou, E. Spiliotis, and V. Assimakopoulos, "Forecast accuracy and inventory performance: Insights on their relationship from the M5 competition data," </w:t>
       </w:r>
       <w:r>
         <w:rPr>
           <w:i/>
           <w:sz w:val="21"/>
         </w:rPr>
-        <w:t>Int. J. Forecast.</w:t>
+        <w:t>Eur. J. Oper. Res.</w:t>
       </w:r>
       <w:r>
         <w:rPr>
           <w:sz w:val="21"/>
         </w:rPr>
-        <w:t>, vol. 37, no. 4, pp. 1748-1764, 2021.</w:t>
+        <w:t>, vol. 322, no. 2, pp. 414-426, 2025, doi: 10.1016/j.ejor.2024.12.033.</w:t>
       </w:r>
     </w:p>
     <w:p>
@@ -24876,55 +23676,27 @@
         <w:rPr>
           <w:sz w:val="21"/>
         </w:rPr>
-        <w:t>[31]</w:t>
+        <w:t>[33]</w:t>
       </w:r>
       <w:r>
         <w:rPr>
           <w:sz w:val="21"/>
         </w:rPr>
         <w:tab/>
-        <w:t xml:space="preserve">Y. Liu, D. Kalaitzi, M. Wang, and C. </w:t>
-      </w:r>
-      <w:proofErr w:type="spellStart"/>
-      <w:r>
-        <w:rPr>
-          <w:sz w:val="21"/>
-        </w:rPr>
-        <w:t>Papanagnou</w:t>
-      </w:r>
-      <w:proofErr w:type="spellEnd"/>
-      <w:r>
-        <w:rPr>
-          <w:sz w:val="21"/>
-        </w:rPr>
-        <w:t xml:space="preserve">, "A machine learning approach to inventory stockout prediction," </w:t>
+        <w:t xml:space="preserve">D. Bertsimas and N. Kallus, "From predictive to prescriptive analytics," </w:t>
       </w:r>
       <w:r>
         <w:rPr>
           <w:i/>
           <w:sz w:val="21"/>
         </w:rPr>
-        <w:t>J. Digit. Econ.</w:t>
+        <w:t>Manage. Sci.</w:t>
       </w:r>
       <w:r>
         <w:rPr>
           <w:sz w:val="21"/>
         </w:rPr>
-        <w:t xml:space="preserve">, vol. 4, pp. 144-155, 2025, </w:t>
-      </w:r>
-      <w:proofErr w:type="spellStart"/>
-      <w:r>
-        <w:rPr>
-          <w:sz w:val="21"/>
-        </w:rPr>
-        <w:t>doi</w:t>
-      </w:r>
-      <w:proofErr w:type="spellEnd"/>
-      <w:r>
-        <w:rPr>
-          <w:sz w:val="21"/>
-        </w:rPr>
-        <w:t>: 10.1016/j.jdec.2025.06.002.</w:t>
+        <w:t>, vol. 66, no. 3, pp. 1025-1044, 2020, doi: 10.1287/mnsc.2018.3253.</w:t>
       </w:r>
     </w:p>
     <w:p>
@@ -24936,55 +23708,27 @@
         <w:rPr>
           <w:sz w:val="21"/>
         </w:rPr>
-        <w:t>[32]</w:t>
+        <w:t>[34]</w:t>
       </w:r>
       <w:r>
         <w:rPr>
           <w:sz w:val="21"/>
         </w:rPr>
         <w:tab/>
-        <w:t xml:space="preserve">E. Theodorou, E. Spiliotis, and V. </w:t>
-      </w:r>
-      <w:proofErr w:type="spellStart"/>
-      <w:r>
-        <w:rPr>
-          <w:sz w:val="21"/>
-        </w:rPr>
-        <w:t>Assimakopoulos</w:t>
-      </w:r>
-      <w:proofErr w:type="spellEnd"/>
-      <w:r>
-        <w:rPr>
-          <w:sz w:val="21"/>
-        </w:rPr>
-        <w:t xml:space="preserve">, "Forecast accuracy and inventory performance: Insights on their relationship from the M5 competition data," </w:t>
+        <w:t xml:space="preserve">G.-Y. Ban and C. Rudin, "The big data newsvendor: Practical insights from machine learning," </w:t>
       </w:r>
       <w:r>
         <w:rPr>
           <w:i/>
           <w:sz w:val="21"/>
         </w:rPr>
-        <w:t>Eur. J. Oper. Res.</w:t>
+        <w:t>Oper. Res.</w:t>
       </w:r>
       <w:r>
         <w:rPr>
           <w:sz w:val="21"/>
         </w:rPr>
-        <w:t xml:space="preserve">, vol. 322, no. 2, pp. 414-426, 2025, </w:t>
-      </w:r>
-      <w:proofErr w:type="spellStart"/>
-      <w:r>
-        <w:rPr>
-          <w:sz w:val="21"/>
-        </w:rPr>
-        <w:t>doi</w:t>
-      </w:r>
-      <w:proofErr w:type="spellEnd"/>
-      <w:r>
-        <w:rPr>
-          <w:sz w:val="21"/>
-        </w:rPr>
-        <w:t>: 10.1016/j.ejor.2024.12.033.</w:t>
+        <w:t>, vol. 67, no. 1, pp. 90-108, 2019, doi: 10.1287/opre.2018.1757.</w:t>
       </w:r>
     </w:p>
     <w:p>
@@ -24996,41 +23740,27 @@
         <w:rPr>
           <w:sz w:val="21"/>
         </w:rPr>
-        <w:t>[33]</w:t>
+        <w:t>[35]</w:t>
       </w:r>
       <w:r>
         <w:rPr>
           <w:sz w:val="21"/>
         </w:rPr>
         <w:tab/>
-        <w:t xml:space="preserve">D. Bertsimas and N. Kallus, "From predictive to prescriptive analytics," </w:t>
+        <w:t xml:space="preserve">S. M. Lundberg and S.-I. Lee, "A unified approach to interpreting model predictions," in </w:t>
       </w:r>
       <w:r>
         <w:rPr>
           <w:i/>
           <w:sz w:val="21"/>
         </w:rPr>
-        <w:t>Manage. Sci.</w:t>
+        <w:t>Proc. Adv. Neural Inf. Process. Syst. (NIPS)</w:t>
       </w:r>
       <w:r>
         <w:rPr>
           <w:sz w:val="21"/>
         </w:rPr>
-        <w:t xml:space="preserve">, vol. 66, no. 3, pp. 1025-1044, 2020, </w:t>
-      </w:r>
-      <w:proofErr w:type="spellStart"/>
-      <w:r>
-        <w:rPr>
-          <w:sz w:val="21"/>
-        </w:rPr>
-        <w:t>doi</w:t>
-      </w:r>
-      <w:proofErr w:type="spellEnd"/>
-      <w:r>
-        <w:rPr>
-          <w:sz w:val="21"/>
-        </w:rPr>
-        <w:t>: 10.1287/mnsc.2018.3253.</w:t>
+        <w:t>, vol. 30, 2017, pp. 4765-4774.</w:t>
       </w:r>
     </w:p>
     <w:p>
@@ -25042,41 +23772,27 @@
         <w:rPr>
           <w:sz w:val="21"/>
         </w:rPr>
-        <w:t>[34]</w:t>
+        <w:t>[36]</w:t>
       </w:r>
       <w:r>
         <w:rPr>
           <w:sz w:val="21"/>
         </w:rPr>
         <w:tab/>
-        <w:t xml:space="preserve">G.-Y. Ban and C. Rudin, "The big data newsvendor: Practical insights from machine learning," </w:t>
+        <w:t xml:space="preserve">L. N. Mishra, B. Senapati, S. K. Nayak, and A. J. Rangari, "Explainable retail demand forecasting: A hybrid LightGBM-SHAP framework for inventory optimization," </w:t>
       </w:r>
       <w:r>
         <w:rPr>
           <w:i/>
           <w:sz w:val="21"/>
         </w:rPr>
-        <w:t>Oper. Res.</w:t>
+        <w:t>IEEE Access</w:t>
       </w:r>
       <w:r>
         <w:rPr>
           <w:sz w:val="21"/>
         </w:rPr>
-        <w:t xml:space="preserve">, vol. 67, no. 1, pp. 90-108, 2019, </w:t>
-      </w:r>
-      <w:proofErr w:type="spellStart"/>
-      <w:r>
-        <w:rPr>
-          <w:sz w:val="21"/>
-        </w:rPr>
-        <w:t>doi</w:t>
-      </w:r>
-      <w:proofErr w:type="spellEnd"/>
-      <w:r>
-        <w:rPr>
-          <w:sz w:val="21"/>
-        </w:rPr>
-        <w:t>: 10.1287/opre.2018.1757.</w:t>
+        <w:t>, vol. 14, pp. 43613-43633, 2026, doi: 10.1109/ACCESS.2026.3675540.</w:t>
       </w:r>
     </w:p>
     <w:p>
@@ -25088,27 +23804,27 @@
         <w:rPr>
           <w:sz w:val="21"/>
         </w:rPr>
-        <w:t>[35]</w:t>
+        <w:t>[37]</w:t>
       </w:r>
       <w:r>
         <w:rPr>
           <w:sz w:val="21"/>
         </w:rPr>
         <w:tab/>
-        <w:t xml:space="preserve">S. M. Lundberg and S.-I. Lee, "A unified approach to interpreting model predictions," in </w:t>
+        <w:t xml:space="preserve">J. M. Rožanec, B. Fortuna, and D. Mladenić, "Knowledge graph-based rich and confidentiality preserving explainable artificial intelligence (XAI)," </w:t>
       </w:r>
       <w:r>
         <w:rPr>
           <w:i/>
           <w:sz w:val="21"/>
         </w:rPr>
-        <w:t>Proc. Adv. Neural Inf. Process. Syst. (NIPS)</w:t>
+        <w:t>Inf. Fusion</w:t>
       </w:r>
       <w:r>
         <w:rPr>
           <w:sz w:val="21"/>
         </w:rPr>
-        <w:t>, vol. 30, 2017, pp. 4765-4774.</w:t>
+        <w:t>, vol. 81, pp. 91-102, 2022, doi: 10.1016/j.inffus.2021.11.015.</w:t>
       </w:r>
     </w:p>
     <w:p>
@@ -25120,69 +23836,27 @@
         <w:rPr>
           <w:sz w:val="21"/>
         </w:rPr>
-        <w:t>[36]</w:t>
+        <w:t>[38]</w:t>
       </w:r>
       <w:r>
         <w:rPr>
           <w:sz w:val="21"/>
         </w:rPr>
         <w:tab/>
-        <w:t xml:space="preserve">L. N. Mishra, B. Senapati, S. K. Nayak, and A. J. </w:t>
-      </w:r>
-      <w:proofErr w:type="spellStart"/>
-      <w:r>
-        <w:rPr>
-          <w:sz w:val="21"/>
-        </w:rPr>
-        <w:t>Rangari</w:t>
-      </w:r>
-      <w:proofErr w:type="spellEnd"/>
-      <w:r>
-        <w:rPr>
-          <w:sz w:val="21"/>
-        </w:rPr>
-        <w:t xml:space="preserve">, "Explainable retail demand forecasting: A hybrid </w:t>
-      </w:r>
-      <w:proofErr w:type="spellStart"/>
-      <w:r>
-        <w:rPr>
-          <w:sz w:val="21"/>
-        </w:rPr>
-        <w:t>LightGBM</w:t>
-      </w:r>
-      <w:proofErr w:type="spellEnd"/>
-      <w:r>
-        <w:rPr>
-          <w:sz w:val="21"/>
-        </w:rPr>
-        <w:t xml:space="preserve">-SHAP framework for inventory optimization," </w:t>
+        <w:t xml:space="preserve">V. Chernozhukov, D. Chetverikov, M. Demirer, E. Duflo, C. Hansen, W. Newey, and J. Robins, "Double/debiased machine learning for treatment and structural parameters," </w:t>
       </w:r>
       <w:r>
         <w:rPr>
           <w:i/>
           <w:sz w:val="21"/>
         </w:rPr>
-        <w:t>IEEE Access</w:t>
+        <w:t>Econom. J.</w:t>
       </w:r>
       <w:r>
         <w:rPr>
           <w:sz w:val="21"/>
         </w:rPr>
-        <w:t xml:space="preserve">, vol. 14, pp. 43613-43633, 2026, </w:t>
-      </w:r>
-      <w:proofErr w:type="spellStart"/>
-      <w:r>
-        <w:rPr>
-          <w:sz w:val="21"/>
-        </w:rPr>
-        <w:t>doi</w:t>
-      </w:r>
-      <w:proofErr w:type="spellEnd"/>
-      <w:r>
-        <w:rPr>
-          <w:sz w:val="21"/>
-        </w:rPr>
-        <w:t>: 10.1109/ACCESS.2026.3675540.</w:t>
+        <w:t>, vol. 21, no. 1, pp. C1-C68, 2018.</w:t>
       </w:r>
     </w:p>
     <w:p>
@@ -25194,69 +23868,27 @@
         <w:rPr>
           <w:sz w:val="21"/>
         </w:rPr>
-        <w:t>[37]</w:t>
+        <w:t>[39]</w:t>
       </w:r>
       <w:r>
         <w:rPr>
           <w:sz w:val="21"/>
         </w:rPr>
         <w:tab/>
-        <w:t xml:space="preserve">J. M. </w:t>
-      </w:r>
-      <w:proofErr w:type="spellStart"/>
-      <w:r>
-        <w:rPr>
-          <w:sz w:val="21"/>
-        </w:rPr>
-        <w:t>Rožanec</w:t>
-      </w:r>
-      <w:proofErr w:type="spellEnd"/>
-      <w:r>
-        <w:rPr>
-          <w:sz w:val="21"/>
-        </w:rPr>
-        <w:t xml:space="preserve">, B. Fortuna, and D. </w:t>
-      </w:r>
-      <w:proofErr w:type="spellStart"/>
-      <w:r>
-        <w:rPr>
-          <w:sz w:val="21"/>
-        </w:rPr>
-        <w:t>Mladenić</w:t>
-      </w:r>
-      <w:proofErr w:type="spellEnd"/>
-      <w:r>
-        <w:rPr>
-          <w:sz w:val="21"/>
-        </w:rPr>
-        <w:t xml:space="preserve">, "Knowledge graph-based rich and confidentiality preserving explainable artificial intelligence (XAI)," </w:t>
+        <w:t xml:space="preserve">S. M. Lundberg, G. Erion, H. Chen, A. DeGrave, J. M. Prutkin, B. Nair, R. Katz, J. Himmelfarb, N. Bansal, and S.-I. Lee, "From local explanations to global understanding with explainable AI for trees," </w:t>
       </w:r>
       <w:r>
         <w:rPr>
           <w:i/>
           <w:sz w:val="21"/>
         </w:rPr>
-        <w:t>Inf. Fusion</w:t>
+        <w:t>Nat. Mach. Intell.</w:t>
       </w:r>
       <w:r>
         <w:rPr>
           <w:sz w:val="21"/>
         </w:rPr>
-        <w:t xml:space="preserve">, vol. 81, pp. 91-102, 2022, </w:t>
-      </w:r>
-      <w:proofErr w:type="spellStart"/>
-      <w:r>
-        <w:rPr>
-          <w:sz w:val="21"/>
-        </w:rPr>
-        <w:t>doi</w:t>
-      </w:r>
-      <w:proofErr w:type="spellEnd"/>
-      <w:r>
-        <w:rPr>
-          <w:sz w:val="21"/>
-        </w:rPr>
-        <w:t>: 10.1016/j.inffus.2021.11.015.</w:t>
+        <w:t>, vol. 2, no. 1, pp. 56-67, 2020.</w:t>
       </w:r>
     </w:p>
     <w:p>
@@ -25268,36 +23900,59 @@
         <w:rPr>
           <w:sz w:val="21"/>
         </w:rPr>
-        <w:t>[38]</w:t>
+        <w:t>[40]</w:t>
       </w:r>
       <w:r>
         <w:rPr>
           <w:sz w:val="21"/>
         </w:rPr>
         <w:tab/>
-        <w:t xml:space="preserve">V. Chernozhukov, D. Chetverikov, M. Demirer, E. Duflo, C. Hansen, W. Newey, and J. Robins, "Double/debiased machine learning for treatment and structural parameters," </w:t>
-      </w:r>
-      <w:proofErr w:type="spellStart"/>
+        <w:t xml:space="preserve">J. MacQueen, "Some methods for classification and analysis of multivariate observations," in </w:t>
+      </w:r>
       <w:r>
         <w:rPr>
           <w:i/>
           <w:sz w:val="21"/>
         </w:rPr>
-        <w:t>Econom</w:t>
-      </w:r>
-      <w:proofErr w:type="spellEnd"/>
+        <w:t>Proc. 5th Berkeley Symp. Math. Statist. Probab.</w:t>
+      </w:r>
+      <w:r>
+        <w:rPr>
+          <w:sz w:val="21"/>
+        </w:rPr>
+        <w:t>, vol. 1, 1967, pp. 281-297.</w:t>
+      </w:r>
+    </w:p>
+    <w:p>
+      <w:pPr>
+        <w:spacing w:after="60"/>
+        <w:ind w:left="648" w:hanging="648"/>
+      </w:pPr>
+      <w:r>
+        <w:rPr>
+          <w:sz w:val="21"/>
+        </w:rPr>
+        <w:t>[41]</w:t>
+      </w:r>
+      <w:r>
+        <w:rPr>
+          <w:sz w:val="21"/>
+        </w:rPr>
+        <w:tab/>
+        <w:t xml:space="preserve">P. J. Rousseeuw, "Silhouettes: A graphical aid to the interpretation and validation of cluster analysis," </w:t>
+      </w:r>
       <w:r>
         <w:rPr>
           <w:i/>
           <w:sz w:val="21"/>
         </w:rPr>
-        <w:t>. J.</w:t>
+        <w:t>J. Comput. Appl. Math.</w:t>
       </w:r>
       <w:r>
         <w:rPr>
           <w:sz w:val="21"/>
         </w:rPr>
-        <w:t>, vol. 21, no. 1, pp. C1-C68, 2018.</w:t>
+        <w:t>, vol. 20, pp. 53-65, 1987.</w:t>
       </w:r>
     </w:p>
     <w:p>
@@ -25309,41 +23964,27 @@
         <w:rPr>
           <w:sz w:val="21"/>
         </w:rPr>
-        <w:t>[39]</w:t>
+        <w:t>[42]</w:t>
       </w:r>
       <w:r>
         <w:rPr>
           <w:sz w:val="21"/>
         </w:rPr>
         <w:tab/>
-        <w:t xml:space="preserve">S. M. Lundberg, G. Erion, H. Chen, A. DeGrave, J. M. </w:t>
-      </w:r>
-      <w:proofErr w:type="spellStart"/>
-      <w:r>
-        <w:rPr>
-          <w:sz w:val="21"/>
-        </w:rPr>
-        <w:t>Prutkin</w:t>
-      </w:r>
-      <w:proofErr w:type="spellEnd"/>
-      <w:r>
-        <w:rPr>
-          <w:sz w:val="21"/>
-        </w:rPr>
-        <w:t xml:space="preserve">, B. Nair, R. Katz, J. Himmelfarb, N. Bansal, and S.-I. Lee, "From local explanations to global understanding with explainable AI for trees," </w:t>
+        <w:t xml:space="preserve">L. Breiman, "Random forests," </w:t>
       </w:r>
       <w:r>
         <w:rPr>
           <w:i/>
           <w:sz w:val="21"/>
         </w:rPr>
-        <w:t>Nat. Mach. Intell.</w:t>
+        <w:t>Mach. Learn.</w:t>
       </w:r>
       <w:r>
         <w:rPr>
           <w:sz w:val="21"/>
         </w:rPr>
-        <w:t>, vol. 2, no. 1, pp. 56-67, 2020.</w:t>
+        <w:t>, vol. 45, no. 1, pp. 5-32, 2001.</w:t>
       </w:r>
     </w:p>
     <w:p>
@@ -25355,43 +23996,104 @@
         <w:rPr>
           <w:sz w:val="21"/>
         </w:rPr>
-        <w:t>[40]</w:t>
+        <w:t>[43]</w:t>
       </w:r>
       <w:r>
         <w:rPr>
           <w:sz w:val="21"/>
         </w:rPr>
         <w:tab/>
-        <w:t xml:space="preserve">J. MacQueen, "Some methods for classification and analysis of multivariate observations," in </w:t>
+        <w:t xml:space="preserve">J. H. Friedman, "Greedy function approximation: A gradient boosting machine," </w:t>
       </w:r>
       <w:r>
         <w:rPr>
           <w:i/>
           <w:sz w:val="21"/>
         </w:rPr>
-        <w:t xml:space="preserve">Proc. 5th Berkeley Symp. Math. Statist. </w:t>
-      </w:r>
-      <w:proofErr w:type="spellStart"/>
+        <w:t>Ann. Statist.</w:t>
+      </w:r>
+      <w:r>
+        <w:rPr>
+          <w:sz w:val="21"/>
+        </w:rPr>
+        <w:t>, vol. 29, no. 5, pp. 1189-1232, 2001.</w:t>
+      </w:r>
+    </w:p>
+    <w:p>
+      <w:pPr>
+        <w:spacing w:after="60"/>
+        <w:ind w:left="648" w:hanging="648"/>
+      </w:pPr>
+      <w:r>
+        <w:rPr>
+          <w:sz w:val="21"/>
+        </w:rPr>
+        <w:t>[44]</w:t>
+      </w:r>
+      <w:r>
+        <w:rPr>
+          <w:sz w:val="21"/>
+        </w:rPr>
+        <w:tab/>
+        <w:t xml:space="preserve">R. Koenker and G. Bassett, "Regression quantiles," </w:t>
+      </w:r>
       <w:r>
         <w:rPr>
           <w:i/>
           <w:sz w:val="21"/>
         </w:rPr>
-        <w:t>Probab</w:t>
-      </w:r>
-      <w:proofErr w:type="spellEnd"/>
+        <w:t>Econometrica</w:t>
+      </w:r>
+      <w:r>
+        <w:rPr>
+          <w:sz w:val="21"/>
+        </w:rPr>
+        <w:t>, vol. 46, no. 1, pp. 33-50, 1978.</w:t>
+      </w:r>
+    </w:p>
+    <w:p>
+      <w:pPr>
+        <w:spacing w:after="60"/>
+        <w:ind w:left="648" w:hanging="648"/>
+      </w:pPr>
+      <w:r>
+        <w:rPr>
+          <w:sz w:val="21"/>
+        </w:rPr>
+        <w:t>[45]</w:t>
+      </w:r>
+      <w:r>
+        <w:rPr>
+          <w:sz w:val="21"/>
+        </w:rPr>
+        <w:tab/>
+        <w:t xml:space="preserve">F. Pedregosa </w:t>
+      </w:r>
       <w:r>
         <w:rPr>
           <w:i/>
           <w:sz w:val="21"/>
         </w:rPr>
-        <w:t>.</w:t>
+        <w:t>et al.</w:t>
       </w:r>
       <w:r>
         <w:rPr>
           <w:sz w:val="21"/>
         </w:rPr>
-        <w:t>, vol. 1, 1967, pp. 281-297.</w:t>
+        <w:t xml:space="preserve">, "Scikit-learn: Machine learning in Python," </w:t>
+      </w:r>
+      <w:r>
+        <w:rPr>
+          <w:i/>
+          <w:sz w:val="21"/>
+        </w:rPr>
+        <w:t>J. Mach. Learn. Res.</w:t>
+      </w:r>
+      <w:r>
+        <w:rPr>
+          <w:sz w:val="21"/>
+        </w:rPr>
+        <w:t>, vol. 12, pp. 2825-2830, 2011.</w:t>
       </w:r>
     </w:p>
     <w:p>
@@ -25403,275 +24105,14 @@
         <w:rPr>
           <w:sz w:val="21"/>
         </w:rPr>
-        <w:t>[41]</w:t>
+        <w:t>[46]</w:t>
       </w:r>
       <w:r>
         <w:rPr>
           <w:sz w:val="21"/>
         </w:rPr>
         <w:tab/>
-        <w:t xml:space="preserve">P. J. </w:t>
-      </w:r>
-      <w:proofErr w:type="spellStart"/>
-      <w:r>
-        <w:rPr>
-          <w:sz w:val="21"/>
-        </w:rPr>
-        <w:t>Rousseeuw</w:t>
-      </w:r>
-      <w:proofErr w:type="spellEnd"/>
-      <w:r>
-        <w:rPr>
-          <w:sz w:val="21"/>
-        </w:rPr>
-        <w:t xml:space="preserve">, "Silhouettes: A graphical aid to the interpretation and validation of cluster analysis," </w:t>
-      </w:r>
-      <w:r>
-        <w:rPr>
-          <w:i/>
-          <w:sz w:val="21"/>
-        </w:rPr>
-        <w:t xml:space="preserve">J. </w:t>
-      </w:r>
-      <w:proofErr w:type="spellStart"/>
-      <w:r>
-        <w:rPr>
-          <w:i/>
-          <w:sz w:val="21"/>
-        </w:rPr>
-        <w:t>Comput</w:t>
-      </w:r>
-      <w:proofErr w:type="spellEnd"/>
-      <w:r>
-        <w:rPr>
-          <w:i/>
-          <w:sz w:val="21"/>
-        </w:rPr>
-        <w:t>. Appl. Math.</w:t>
-      </w:r>
-      <w:r>
-        <w:rPr>
-          <w:sz w:val="21"/>
-        </w:rPr>
-        <w:t>, vol. 20, pp. 53-65, 1987.</w:t>
-      </w:r>
-    </w:p>
-    <w:p>
-      <w:pPr>
-        <w:spacing w:after="60"/>
-        <w:ind w:left="648" w:hanging="648"/>
-      </w:pPr>
-      <w:r>
-        <w:rPr>
-          <w:sz w:val="21"/>
-        </w:rPr>
-        <w:t>[42]</w:t>
-      </w:r>
-      <w:r>
-        <w:rPr>
-          <w:sz w:val="21"/>
-        </w:rPr>
-        <w:tab/>
-        <w:t xml:space="preserve">L. </w:t>
-      </w:r>
-      <w:proofErr w:type="spellStart"/>
-      <w:r>
-        <w:rPr>
-          <w:sz w:val="21"/>
-        </w:rPr>
-        <w:t>Breiman</w:t>
-      </w:r>
-      <w:proofErr w:type="spellEnd"/>
-      <w:r>
-        <w:rPr>
-          <w:sz w:val="21"/>
-        </w:rPr>
-        <w:t xml:space="preserve">, "Random forests," </w:t>
-      </w:r>
-      <w:r>
-        <w:rPr>
-          <w:i/>
-          <w:sz w:val="21"/>
-        </w:rPr>
-        <w:t>Mach. Learn.</w:t>
-      </w:r>
-      <w:r>
-        <w:rPr>
-          <w:sz w:val="21"/>
-        </w:rPr>
-        <w:t>, vol. 45, no. 1, pp. 5-32, 2001.</w:t>
-      </w:r>
-    </w:p>
-    <w:p>
-      <w:pPr>
-        <w:spacing w:after="60"/>
-        <w:ind w:left="648" w:hanging="648"/>
-      </w:pPr>
-      <w:r>
-        <w:rPr>
-          <w:sz w:val="21"/>
-        </w:rPr>
-        <w:t>[43]</w:t>
-      </w:r>
-      <w:r>
-        <w:rPr>
-          <w:sz w:val="21"/>
-        </w:rPr>
-        <w:tab/>
-        <w:t xml:space="preserve">J. H. Friedman, "Greedy function approximation: A gradient boosting machine," </w:t>
-      </w:r>
-      <w:r>
-        <w:rPr>
-          <w:i/>
-          <w:sz w:val="21"/>
-        </w:rPr>
-        <w:t>Ann. Statist.</w:t>
-      </w:r>
-      <w:r>
-        <w:rPr>
-          <w:sz w:val="21"/>
-        </w:rPr>
-        <w:t>, vol. 29, no. 5, pp. 1189-1232, 2001.</w:t>
-      </w:r>
-    </w:p>
-    <w:p>
-      <w:pPr>
-        <w:spacing w:after="60"/>
-        <w:ind w:left="648" w:hanging="648"/>
-      </w:pPr>
-      <w:r>
-        <w:rPr>
-          <w:sz w:val="21"/>
-        </w:rPr>
-        <w:t>[44]</w:t>
-      </w:r>
-      <w:r>
-        <w:rPr>
-          <w:sz w:val="21"/>
-        </w:rPr>
-        <w:tab/>
-        <w:t xml:space="preserve">R. </w:t>
-      </w:r>
-      <w:proofErr w:type="spellStart"/>
-      <w:r>
-        <w:rPr>
-          <w:sz w:val="21"/>
-        </w:rPr>
-        <w:t>Koenker</w:t>
-      </w:r>
-      <w:proofErr w:type="spellEnd"/>
-      <w:r>
-        <w:rPr>
-          <w:sz w:val="21"/>
-        </w:rPr>
-        <w:t xml:space="preserve"> and G. Bassett, "Regression quantiles," </w:t>
-      </w:r>
-      <w:proofErr w:type="spellStart"/>
-      <w:r>
-        <w:rPr>
-          <w:i/>
-          <w:sz w:val="21"/>
-        </w:rPr>
-        <w:t>Econometrica</w:t>
-      </w:r>
-      <w:proofErr w:type="spellEnd"/>
-      <w:r>
-        <w:rPr>
-          <w:sz w:val="21"/>
-        </w:rPr>
-        <w:t>, vol. 46, no. 1, pp. 33-50, 1978.</w:t>
-      </w:r>
-    </w:p>
-    <w:p>
-      <w:pPr>
-        <w:spacing w:after="60"/>
-        <w:ind w:left="648" w:hanging="648"/>
-      </w:pPr>
-      <w:r>
-        <w:rPr>
-          <w:sz w:val="21"/>
-        </w:rPr>
-        <w:t>[45]</w:t>
-      </w:r>
-      <w:r>
-        <w:rPr>
-          <w:sz w:val="21"/>
-        </w:rPr>
-        <w:tab/>
-        <w:t xml:space="preserve">F. Pedregosa </w:t>
-      </w:r>
-      <w:r>
-        <w:rPr>
-          <w:i/>
-          <w:sz w:val="21"/>
-        </w:rPr>
-        <w:t>et al.</w:t>
-      </w:r>
-      <w:r>
-        <w:rPr>
-          <w:sz w:val="21"/>
-        </w:rPr>
-        <w:t xml:space="preserve">, "Scikit-learn: Machine learning in Python," </w:t>
-      </w:r>
-      <w:r>
-        <w:rPr>
-          <w:i/>
-          <w:sz w:val="21"/>
-        </w:rPr>
-        <w:t>J. Mach. Learn. Res.</w:t>
-      </w:r>
-      <w:r>
-        <w:rPr>
-          <w:sz w:val="21"/>
-        </w:rPr>
-        <w:t>, vol. 12, pp. 2825-2830, 2011.</w:t>
-      </w:r>
-    </w:p>
-    <w:p>
-      <w:pPr>
-        <w:spacing w:after="60"/>
-        <w:ind w:left="648" w:hanging="648"/>
-      </w:pPr>
-      <w:r>
-        <w:rPr>
-          <w:sz w:val="21"/>
-        </w:rPr>
-        <w:t>[46]</w:t>
-      </w:r>
-      <w:r>
-        <w:rPr>
-          <w:sz w:val="21"/>
-        </w:rPr>
-        <w:tab/>
-        <w:t xml:space="preserve">T. H. A. </w:t>
-      </w:r>
-      <w:proofErr w:type="spellStart"/>
-      <w:r>
-        <w:rPr>
-          <w:sz w:val="21"/>
-        </w:rPr>
-        <w:t>Bijmolt</w:t>
-      </w:r>
-      <w:proofErr w:type="spellEnd"/>
-      <w:r>
-        <w:rPr>
-          <w:sz w:val="21"/>
-        </w:rPr>
-        <w:t xml:space="preserve">, H. J. van </w:t>
-      </w:r>
-      <w:proofErr w:type="spellStart"/>
-      <w:r>
-        <w:rPr>
-          <w:sz w:val="21"/>
-        </w:rPr>
-        <w:t>Heerde</w:t>
-      </w:r>
-      <w:proofErr w:type="spellEnd"/>
-      <w:r>
-        <w:rPr>
-          <w:sz w:val="21"/>
-        </w:rPr>
-        <w:t xml:space="preserve">, and R. G. M. Pieters, "New empirical generalizations on the determinants of price elasticity," </w:t>
+        <w:t xml:space="preserve">T. H. A. Bijmolt, H. J. van Heerde, and R. G. M. Pieters, "New empirical generalizations on the determinants of price elasticity," </w:t>
       </w:r>
       <w:r>
         <w:rPr>
@@ -25821,75 +24262,11 @@
               <w:keepNext/>
               <w:spacing w:after="0"/>
             </w:pPr>
-            <w:proofErr w:type="spellStart"/>
             <w:r>
               <w:rPr>
                 <w:sz w:val="19"/>
               </w:rPr>
-              <w:t>HistGradientBoostingRegressor</w:t>
-            </w:r>
-            <w:proofErr w:type="spellEnd"/>
-            <w:r>
-              <w:rPr>
-                <w:sz w:val="19"/>
-              </w:rPr>
-              <w:t xml:space="preserve">; loss = squared error on log(1+sales); </w:t>
-            </w:r>
-            <w:proofErr w:type="spellStart"/>
-            <w:r>
-              <w:rPr>
-                <w:sz w:val="19"/>
-              </w:rPr>
-              <w:t>learning_rate</w:t>
-            </w:r>
-            <w:proofErr w:type="spellEnd"/>
-            <w:r>
-              <w:rPr>
-                <w:sz w:val="19"/>
-              </w:rPr>
-              <w:t xml:space="preserve"> 0.08; </w:t>
-            </w:r>
-            <w:proofErr w:type="spellStart"/>
-            <w:r>
-              <w:rPr>
-                <w:sz w:val="19"/>
-              </w:rPr>
-              <w:t>max_iter</w:t>
-            </w:r>
-            <w:proofErr w:type="spellEnd"/>
-            <w:r>
-              <w:rPr>
-                <w:sz w:val="19"/>
-              </w:rPr>
-              <w:t xml:space="preserve"> 400; </w:t>
-            </w:r>
-            <w:proofErr w:type="spellStart"/>
-            <w:r>
-              <w:rPr>
-                <w:sz w:val="19"/>
-              </w:rPr>
-              <w:t>max_leaf_nodes</w:t>
-            </w:r>
-            <w:proofErr w:type="spellEnd"/>
-            <w:r>
-              <w:rPr>
-                <w:sz w:val="19"/>
-              </w:rPr>
-              <w:t xml:space="preserve"> 127; </w:t>
-            </w:r>
-            <w:proofErr w:type="spellStart"/>
-            <w:r>
-              <w:rPr>
-                <w:sz w:val="19"/>
-              </w:rPr>
-              <w:t>min_samples_leaf</w:t>
-            </w:r>
-            <w:proofErr w:type="spellEnd"/>
-            <w:r>
-              <w:rPr>
-                <w:sz w:val="19"/>
-              </w:rPr>
-              <w:t xml:space="preserve"> 40; l2_regularization 0.0</w:t>
+              <w:t>HistGradientBoostingRegressor; loss = squared error on log(1+sales); learning_rate 0.08; max_iter 400; max_leaf_nodes 127; min_samples_leaf 40; l2_regularization 0.0</w:t>
             </w:r>
           </w:p>
         </w:tc>
@@ -25963,61 +24340,11 @@
               <w:keepNext/>
               <w:spacing w:after="0"/>
             </w:pPr>
-            <w:proofErr w:type="spellStart"/>
             <w:r>
               <w:rPr>
                 <w:sz w:val="19"/>
               </w:rPr>
-              <w:t>n_estimators</w:t>
-            </w:r>
-            <w:proofErr w:type="spellEnd"/>
-            <w:r>
-              <w:rPr>
-                <w:sz w:val="19"/>
-              </w:rPr>
-              <w:t xml:space="preserve"> 120; </w:t>
-            </w:r>
-            <w:proofErr w:type="spellStart"/>
-            <w:r>
-              <w:rPr>
-                <w:sz w:val="19"/>
-              </w:rPr>
-              <w:t>min_samples_leaf</w:t>
-            </w:r>
-            <w:proofErr w:type="spellEnd"/>
-            <w:r>
-              <w:rPr>
-                <w:sz w:val="19"/>
-              </w:rPr>
-              <w:t xml:space="preserve"> 5; </w:t>
-            </w:r>
-            <w:proofErr w:type="spellStart"/>
-            <w:r>
-              <w:rPr>
-                <w:sz w:val="19"/>
-              </w:rPr>
-              <w:t>max_features</w:t>
-            </w:r>
-            <w:proofErr w:type="spellEnd"/>
-            <w:r>
-              <w:rPr>
-                <w:sz w:val="19"/>
-              </w:rPr>
-              <w:t xml:space="preserve"> 0.5; </w:t>
-            </w:r>
-            <w:proofErr w:type="spellStart"/>
-            <w:r>
-              <w:rPr>
-                <w:sz w:val="19"/>
-              </w:rPr>
-              <w:t>max_samples</w:t>
-            </w:r>
-            <w:proofErr w:type="spellEnd"/>
-            <w:r>
-              <w:rPr>
-                <w:sz w:val="19"/>
-              </w:rPr>
-              <w:t xml:space="preserve"> 0.3</w:t>
+              <w:t>n_estimators 120; min_samples_leaf 5; max_features 0.5; max_samples 0.3</w:t>
             </w:r>
           </w:p>
         </w:tc>
@@ -26091,75 +24418,11 @@
               <w:keepNext/>
               <w:spacing w:after="0"/>
             </w:pPr>
-            <w:proofErr w:type="spellStart"/>
             <w:r>
               <w:rPr>
                 <w:sz w:val="19"/>
               </w:rPr>
-              <w:t>HistGradientBoostingClassifier</w:t>
-            </w:r>
-            <w:proofErr w:type="spellEnd"/>
-            <w:r>
-              <w:rPr>
-                <w:sz w:val="19"/>
-              </w:rPr>
-              <w:t xml:space="preserve">; </w:t>
-            </w:r>
-            <w:proofErr w:type="spellStart"/>
-            <w:r>
-              <w:rPr>
-                <w:sz w:val="19"/>
-              </w:rPr>
-              <w:t>max_iter</w:t>
-            </w:r>
-            <w:proofErr w:type="spellEnd"/>
-            <w:r>
-              <w:rPr>
-                <w:sz w:val="19"/>
-              </w:rPr>
-              <w:t xml:space="preserve"> 300; </w:t>
-            </w:r>
-            <w:proofErr w:type="spellStart"/>
-            <w:r>
-              <w:rPr>
-                <w:sz w:val="19"/>
-              </w:rPr>
-              <w:t>learning_rate</w:t>
-            </w:r>
-            <w:proofErr w:type="spellEnd"/>
-            <w:r>
-              <w:rPr>
-                <w:sz w:val="19"/>
-              </w:rPr>
-              <w:t xml:space="preserve"> 0.05; </w:t>
-            </w:r>
-            <w:proofErr w:type="spellStart"/>
-            <w:r>
-              <w:rPr>
-                <w:sz w:val="19"/>
-              </w:rPr>
-              <w:t>max_leaf_nodes</w:t>
-            </w:r>
-            <w:proofErr w:type="spellEnd"/>
-            <w:r>
-              <w:rPr>
-                <w:sz w:val="19"/>
-              </w:rPr>
-              <w:t xml:space="preserve"> 31; </w:t>
-            </w:r>
-            <w:proofErr w:type="spellStart"/>
-            <w:r>
-              <w:rPr>
-                <w:sz w:val="19"/>
-              </w:rPr>
-              <w:t>min_samples_leaf</w:t>
-            </w:r>
-            <w:proofErr w:type="spellEnd"/>
-            <w:r>
-              <w:rPr>
-                <w:sz w:val="19"/>
-              </w:rPr>
-              <w:t xml:space="preserve"> 50; l2_regularization 1.0; threshold tuned on validation (max F1)</w:t>
+              <w:t>HistGradientBoostingClassifier; max_iter 300; learning_rate 0.05; max_leaf_nodes 31; min_samples_leaf 50; l2_regularization 1.0; threshold tuned on validation (max F1)</w:t>
             </w:r>
           </w:p>
         </w:tc>
@@ -26194,70 +24457,12 @@
               <w:keepNext/>
               <w:spacing w:after="0"/>
             </w:pPr>
-            <w:proofErr w:type="spellStart"/>
             <w:r>
               <w:rPr>
                 <w:sz w:val="19"/>
               </w:rPr>
-              <w:t>n_estimators</w:t>
-            </w:r>
-            <w:proofErr w:type="spellEnd"/>
-            <w:r>
-              <w:rPr>
-                <w:sz w:val="19"/>
-              </w:rPr>
-              <w:t xml:space="preserve"> 200; </w:t>
-            </w:r>
-            <w:proofErr w:type="spellStart"/>
-            <w:r>
-              <w:rPr>
-                <w:sz w:val="19"/>
-              </w:rPr>
-              <w:t>min_samples_leaf</w:t>
-            </w:r>
-            <w:proofErr w:type="spellEnd"/>
-            <w:r>
-              <w:rPr>
-                <w:sz w:val="19"/>
-              </w:rPr>
-              <w:t xml:space="preserve"> 20; </w:t>
-            </w:r>
-            <w:proofErr w:type="spellStart"/>
-            <w:r>
-              <w:rPr>
-                <w:sz w:val="19"/>
-              </w:rPr>
-              <w:t>max_features</w:t>
-            </w:r>
-            <w:proofErr w:type="spellEnd"/>
-            <w:r>
-              <w:rPr>
-                <w:sz w:val="19"/>
-              </w:rPr>
-              <w:t xml:space="preserve"> 0.5; </w:t>
-            </w:r>
-            <w:proofErr w:type="spellStart"/>
-            <w:r>
-              <w:rPr>
-                <w:sz w:val="19"/>
-              </w:rPr>
-              <w:t>class_weight</w:t>
-            </w:r>
-            <w:proofErr w:type="spellEnd"/>
-            <w:r>
-              <w:rPr>
-                <w:sz w:val="19"/>
-              </w:rPr>
-              <w:t xml:space="preserve"> </w:t>
-            </w:r>
-            <w:proofErr w:type="spellStart"/>
-            <w:r>
-              <w:rPr>
-                <w:sz w:val="19"/>
-              </w:rPr>
-              <w:t>balanced_subsample</w:t>
-            </w:r>
-            <w:proofErr w:type="spellEnd"/>
+              <w:t>n_estimators 200; min_samples_leaf 20; max_features 0.5; class_weight balanced_subsample</w:t>
+            </w:r>
           </w:p>
         </w:tc>
       </w:tr>
@@ -26291,33 +24496,11 @@
               <w:keepNext/>
               <w:spacing w:after="0"/>
             </w:pPr>
-            <w:proofErr w:type="spellStart"/>
             <w:r>
               <w:rPr>
                 <w:sz w:val="19"/>
               </w:rPr>
-              <w:t>class_weight</w:t>
-            </w:r>
-            <w:proofErr w:type="spellEnd"/>
-            <w:r>
-              <w:rPr>
-                <w:sz w:val="19"/>
-              </w:rPr>
-              <w:t xml:space="preserve"> balanced; standard scaling; </w:t>
-            </w:r>
-            <w:proofErr w:type="spellStart"/>
-            <w:r>
-              <w:rPr>
-                <w:sz w:val="19"/>
-              </w:rPr>
-              <w:t>max_iter</w:t>
-            </w:r>
-            <w:proofErr w:type="spellEnd"/>
-            <w:r>
-              <w:rPr>
-                <w:sz w:val="19"/>
-              </w:rPr>
-              <w:t xml:space="preserve"> 2000</w:t>
+              <w:t>class_weight balanced; standard scaling; max_iter 2000</w:t>
             </w:r>
           </w:p>
         </w:tc>
@@ -26356,49 +24539,7 @@
               <w:rPr>
                 <w:sz w:val="19"/>
               </w:rPr>
-              <w:t xml:space="preserve">k = 4; </w:t>
-            </w:r>
-            <w:proofErr w:type="spellStart"/>
-            <w:r>
-              <w:rPr>
-                <w:sz w:val="19"/>
-              </w:rPr>
-              <w:t>n_init</w:t>
-            </w:r>
-            <w:proofErr w:type="spellEnd"/>
-            <w:r>
-              <w:rPr>
-                <w:sz w:val="19"/>
-              </w:rPr>
-              <w:t xml:space="preserve"> 50; </w:t>
-            </w:r>
-            <w:proofErr w:type="spellStart"/>
-            <w:r>
-              <w:rPr>
-                <w:sz w:val="19"/>
-              </w:rPr>
-              <w:t>standardised</w:t>
-            </w:r>
-            <w:proofErr w:type="spellEnd"/>
-            <w:r>
-              <w:rPr>
-                <w:sz w:val="19"/>
-              </w:rPr>
-              <w:t xml:space="preserve"> features; </w:t>
-            </w:r>
-            <w:proofErr w:type="spellStart"/>
-            <w:r>
-              <w:rPr>
-                <w:sz w:val="19"/>
-              </w:rPr>
-              <w:t>random_state</w:t>
-            </w:r>
-            <w:proofErr w:type="spellEnd"/>
-            <w:r>
-              <w:rPr>
-                <w:sz w:val="19"/>
-              </w:rPr>
-              <w:t xml:space="preserve"> 42</w:t>
+              <w:t>k = 4; n_init 50; standardised features; random_state 42</w:t>
             </w:r>
           </w:p>
         </w:tc>
@@ -27969,23 +26110,7 @@
         <w:jc w:val="both"/>
       </w:pPr>
       <w:r>
-        <w:t xml:space="preserve">The project is </w:t>
-      </w:r>
-      <w:proofErr w:type="spellStart"/>
-      <w:r>
-        <w:t>organised</w:t>
-      </w:r>
-      <w:proofErr w:type="spellEnd"/>
-      <w:r>
-        <w:t xml:space="preserve"> as one script per pipeline step. Running python src/run_all.py rebuilds every table and figure in this report; </w:t>
-      </w:r>
-      <w:proofErr w:type="spellStart"/>
-      <w:r>
-        <w:t>streamlit</w:t>
-      </w:r>
-      <w:proofErr w:type="spellEnd"/>
-      <w:r>
-        <w:t xml:space="preserve"> run app/app.py opens the dashboard.</w:t>
+        <w:t>The project is organised as one script per pipeline step. Running python src/run_all.py rebuilds every table and figure in this report; streamlit run app/app.py opens the dashboard.</w:t>
       </w:r>
     </w:p>
     <w:p>
@@ -28419,19 +26544,11 @@
             <w:pPr>
               <w:spacing w:after="0"/>
             </w:pPr>
-            <w:proofErr w:type="spellStart"/>
             <w:r>
               <w:rPr>
                 <w:sz w:val="19"/>
               </w:rPr>
-              <w:t>Streamlit</w:t>
-            </w:r>
-            <w:proofErr w:type="spellEnd"/>
-            <w:r>
-              <w:rPr>
-                <w:sz w:val="19"/>
-              </w:rPr>
-              <w:t xml:space="preserve"> dashboard with what-if simulator</w:t>
+              <w:t>Streamlit dashboard with what-if simulator</w:t>
             </w:r>
           </w:p>
         </w:tc>
@@ -28447,15 +26564,7 @@
         <w:jc w:val="both"/>
       </w:pPr>
       <w:r>
-        <w:t xml:space="preserve">The order-up-to rule at the heart of policy B (from </w:t>
-      </w:r>
-      <w:proofErr w:type="spellStart"/>
-      <w:r>
-        <w:t>src</w:t>
-      </w:r>
-      <w:proofErr w:type="spellEnd"/>
-      <w:r>
-        <w:t>/inventory.py):</w:t>
+        <w:t>The order-up-to rule at the heart of policy B (from src/inventory.py):</w:t>
       </w:r>
     </w:p>
     <w:p>
@@ -28463,389 +26572,64 @@
         <w:spacing w:after="0"/>
         <w:ind w:left="432"/>
       </w:pPr>
-      <w:proofErr w:type="spellStart"/>
       <w:r>
         <w:rPr>
           <w:rFonts w:ascii="Courier New" w:hAnsi="Courier New"/>
           <w:sz w:val="18"/>
         </w:rPr>
-        <w:t>f_sum</w:t>
-      </w:r>
-      <w:proofErr w:type="spellEnd"/>
+        <w:t>f_sum = p.fc[:, sl].sum(1)        # forecast until next delivery</w:t>
+      </w:r>
+    </w:p>
+    <w:p>
+      <w:pPr>
+        <w:spacing w:after="0"/>
+        <w:ind w:left="432"/>
+      </w:pPr>
       <w:r>
         <w:rPr>
           <w:rFonts w:ascii="Courier New" w:hAnsi="Courier New"/>
           <w:sz w:val="18"/>
         </w:rPr>
-        <w:t xml:space="preserve"> = </w:t>
-      </w:r>
-      <w:proofErr w:type="spellStart"/>
+        <w:t>f_day = f_sum / np.maximum(p.open[:, sl].sum(1), 1)</w:t>
+      </w:r>
+    </w:p>
+    <w:p>
+      <w:pPr>
+        <w:spacing w:after="0"/>
+        <w:ind w:left="432"/>
+      </w:pPr>
       <w:r>
         <w:rPr>
           <w:rFonts w:ascii="Courier New" w:hAnsi="Courier New"/>
           <w:sz w:val="18"/>
         </w:rPr>
-        <w:t>p.fc</w:t>
-      </w:r>
-      <w:proofErr w:type="spellEnd"/>
-      <w:proofErr w:type="gramStart"/>
+        <w:t>var   = (p.sigma[:, sl] ** 2).sum(1) + f_day ** 2 * DELAY_VAR</w:t>
+      </w:r>
+    </w:p>
+    <w:p>
+      <w:pPr>
+        <w:spacing w:after="0"/>
+        <w:ind w:left="432"/>
+      </w:pPr>
       <w:r>
         <w:rPr>
           <w:rFonts w:ascii="Courier New" w:hAnsi="Courier New"/>
           <w:sz w:val="18"/>
         </w:rPr>
-        <w:t>[:,</w:t>
-      </w:r>
-      <w:proofErr w:type="gramEnd"/>
+        <w:t>S     = f_sum + DELAY_MEAN * f_day + SERVICE_LEVEL_Z * np.sqrt(var)</w:t>
+      </w:r>
+    </w:p>
+    <w:p>
+      <w:pPr>
+        <w:spacing w:after="0"/>
+        <w:ind w:left="432"/>
+      </w:pPr>
       <w:r>
         <w:rPr>
           <w:rFonts w:ascii="Courier New" w:hAnsi="Courier New"/>
           <w:sz w:val="18"/>
         </w:rPr>
-        <w:t xml:space="preserve"> </w:t>
-      </w:r>
-      <w:proofErr w:type="spellStart"/>
-      <w:r>
-        <w:rPr>
-          <w:rFonts w:ascii="Courier New" w:hAnsi="Courier New"/>
-          <w:sz w:val="18"/>
-        </w:rPr>
-        <w:t>sl</w:t>
-      </w:r>
-      <w:proofErr w:type="spellEnd"/>
-      <w:proofErr w:type="gramStart"/>
-      <w:r>
-        <w:rPr>
-          <w:rFonts w:ascii="Courier New" w:hAnsi="Courier New"/>
-          <w:sz w:val="18"/>
-        </w:rPr>
-        <w:t>].sum</w:t>
-      </w:r>
-      <w:proofErr w:type="gramEnd"/>
-      <w:r>
-        <w:rPr>
-          <w:rFonts w:ascii="Courier New" w:hAnsi="Courier New"/>
-          <w:sz w:val="18"/>
-        </w:rPr>
-        <w:t>(1)        # forecast until next delivery</w:t>
-      </w:r>
-    </w:p>
-    <w:p>
-      <w:pPr>
-        <w:spacing w:after="0"/>
-        <w:ind w:left="432"/>
-      </w:pPr>
-      <w:proofErr w:type="spellStart"/>
-      <w:r>
-        <w:rPr>
-          <w:rFonts w:ascii="Courier New" w:hAnsi="Courier New"/>
-          <w:sz w:val="18"/>
-        </w:rPr>
-        <w:t>f_day</w:t>
-      </w:r>
-      <w:proofErr w:type="spellEnd"/>
-      <w:r>
-        <w:rPr>
-          <w:rFonts w:ascii="Courier New" w:hAnsi="Courier New"/>
-          <w:sz w:val="18"/>
-        </w:rPr>
-        <w:t xml:space="preserve"> = </w:t>
-      </w:r>
-      <w:proofErr w:type="spellStart"/>
-      <w:r>
-        <w:rPr>
-          <w:rFonts w:ascii="Courier New" w:hAnsi="Courier New"/>
-          <w:sz w:val="18"/>
-        </w:rPr>
-        <w:t>f_sum</w:t>
-      </w:r>
-      <w:proofErr w:type="spellEnd"/>
-      <w:r>
-        <w:rPr>
-          <w:rFonts w:ascii="Courier New" w:hAnsi="Courier New"/>
-          <w:sz w:val="18"/>
-        </w:rPr>
-        <w:t xml:space="preserve"> / </w:t>
-      </w:r>
-      <w:proofErr w:type="spellStart"/>
-      <w:proofErr w:type="gramStart"/>
-      <w:r>
-        <w:rPr>
-          <w:rFonts w:ascii="Courier New" w:hAnsi="Courier New"/>
-          <w:sz w:val="18"/>
-        </w:rPr>
-        <w:t>np.maximum</w:t>
-      </w:r>
-      <w:proofErr w:type="spellEnd"/>
-      <w:proofErr w:type="gramEnd"/>
-      <w:r>
-        <w:rPr>
-          <w:rFonts w:ascii="Courier New" w:hAnsi="Courier New"/>
-          <w:sz w:val="18"/>
-        </w:rPr>
-        <w:t>(</w:t>
-      </w:r>
-      <w:proofErr w:type="spellStart"/>
-      <w:proofErr w:type="gramStart"/>
-      <w:r>
-        <w:rPr>
-          <w:rFonts w:ascii="Courier New" w:hAnsi="Courier New"/>
-          <w:sz w:val="18"/>
-        </w:rPr>
-        <w:t>p.open</w:t>
-      </w:r>
-      <w:proofErr w:type="spellEnd"/>
-      <w:r>
-        <w:rPr>
-          <w:rFonts w:ascii="Courier New" w:hAnsi="Courier New"/>
-          <w:sz w:val="18"/>
-        </w:rPr>
-        <w:t>[:,</w:t>
-      </w:r>
-      <w:proofErr w:type="gramEnd"/>
-      <w:r>
-        <w:rPr>
-          <w:rFonts w:ascii="Courier New" w:hAnsi="Courier New"/>
-          <w:sz w:val="18"/>
-        </w:rPr>
-        <w:t xml:space="preserve"> </w:t>
-      </w:r>
-      <w:proofErr w:type="spellStart"/>
-      <w:r>
-        <w:rPr>
-          <w:rFonts w:ascii="Courier New" w:hAnsi="Courier New"/>
-          <w:sz w:val="18"/>
-        </w:rPr>
-        <w:t>sl</w:t>
-      </w:r>
-      <w:proofErr w:type="spellEnd"/>
-      <w:proofErr w:type="gramStart"/>
-      <w:r>
-        <w:rPr>
-          <w:rFonts w:ascii="Courier New" w:hAnsi="Courier New"/>
-          <w:sz w:val="18"/>
-        </w:rPr>
-        <w:t>].sum</w:t>
-      </w:r>
-      <w:proofErr w:type="gramEnd"/>
-      <w:r>
-        <w:rPr>
-          <w:rFonts w:ascii="Courier New" w:hAnsi="Courier New"/>
-          <w:sz w:val="18"/>
-        </w:rPr>
-        <w:t>(1), 1)</w:t>
-      </w:r>
-    </w:p>
-    <w:p>
-      <w:pPr>
-        <w:spacing w:after="0"/>
-        <w:ind w:left="432"/>
-      </w:pPr>
-      <w:r>
-        <w:rPr>
-          <w:rFonts w:ascii="Courier New" w:hAnsi="Courier New"/>
-          <w:sz w:val="18"/>
-        </w:rPr>
-        <w:t>var   = (</w:t>
-      </w:r>
-      <w:proofErr w:type="spellStart"/>
-      <w:proofErr w:type="gramStart"/>
-      <w:r>
-        <w:rPr>
-          <w:rFonts w:ascii="Courier New" w:hAnsi="Courier New"/>
-          <w:sz w:val="18"/>
-        </w:rPr>
-        <w:t>p.sigma</w:t>
-      </w:r>
-      <w:proofErr w:type="spellEnd"/>
-      <w:r>
-        <w:rPr>
-          <w:rFonts w:ascii="Courier New" w:hAnsi="Courier New"/>
-          <w:sz w:val="18"/>
-        </w:rPr>
-        <w:t>[:,</w:t>
-      </w:r>
-      <w:proofErr w:type="gramEnd"/>
-      <w:r>
-        <w:rPr>
-          <w:rFonts w:ascii="Courier New" w:hAnsi="Courier New"/>
-          <w:sz w:val="18"/>
-        </w:rPr>
-        <w:t xml:space="preserve"> </w:t>
-      </w:r>
-      <w:proofErr w:type="spellStart"/>
-      <w:r>
-        <w:rPr>
-          <w:rFonts w:ascii="Courier New" w:hAnsi="Courier New"/>
-          <w:sz w:val="18"/>
-        </w:rPr>
-        <w:t>sl</w:t>
-      </w:r>
-      <w:proofErr w:type="spellEnd"/>
-      <w:r>
-        <w:rPr>
-          <w:rFonts w:ascii="Courier New" w:hAnsi="Courier New"/>
-          <w:sz w:val="18"/>
-        </w:rPr>
-        <w:t>] ** 2</w:t>
-      </w:r>
-      <w:proofErr w:type="gramStart"/>
-      <w:r>
-        <w:rPr>
-          <w:rFonts w:ascii="Courier New" w:hAnsi="Courier New"/>
-          <w:sz w:val="18"/>
-        </w:rPr>
-        <w:t>).sum</w:t>
-      </w:r>
-      <w:proofErr w:type="gramEnd"/>
-      <w:r>
-        <w:rPr>
-          <w:rFonts w:ascii="Courier New" w:hAnsi="Courier New"/>
-          <w:sz w:val="18"/>
-        </w:rPr>
-        <w:t xml:space="preserve">(1) + </w:t>
-      </w:r>
-      <w:proofErr w:type="spellStart"/>
-      <w:r>
-        <w:rPr>
-          <w:rFonts w:ascii="Courier New" w:hAnsi="Courier New"/>
-          <w:sz w:val="18"/>
-        </w:rPr>
-        <w:t>f_day</w:t>
-      </w:r>
-      <w:proofErr w:type="spellEnd"/>
-      <w:r>
-        <w:rPr>
-          <w:rFonts w:ascii="Courier New" w:hAnsi="Courier New"/>
-          <w:sz w:val="18"/>
-        </w:rPr>
-        <w:t xml:space="preserve"> ** 2 * DELAY_VAR</w:t>
-      </w:r>
-    </w:p>
-    <w:p>
-      <w:pPr>
-        <w:spacing w:after="0"/>
-        <w:ind w:left="432"/>
-      </w:pPr>
-      <w:r>
-        <w:rPr>
-          <w:rFonts w:ascii="Courier New" w:hAnsi="Courier New"/>
-          <w:sz w:val="18"/>
-        </w:rPr>
-        <w:t xml:space="preserve">S     = </w:t>
-      </w:r>
-      <w:proofErr w:type="spellStart"/>
-      <w:r>
-        <w:rPr>
-          <w:rFonts w:ascii="Courier New" w:hAnsi="Courier New"/>
-          <w:sz w:val="18"/>
-        </w:rPr>
-        <w:t>f_sum</w:t>
-      </w:r>
-      <w:proofErr w:type="spellEnd"/>
-      <w:r>
-        <w:rPr>
-          <w:rFonts w:ascii="Courier New" w:hAnsi="Courier New"/>
-          <w:sz w:val="18"/>
-        </w:rPr>
-        <w:t xml:space="preserve"> + DELAY_MEAN * </w:t>
-      </w:r>
-      <w:proofErr w:type="spellStart"/>
-      <w:r>
-        <w:rPr>
-          <w:rFonts w:ascii="Courier New" w:hAnsi="Courier New"/>
-          <w:sz w:val="18"/>
-        </w:rPr>
-        <w:t>f_day</w:t>
-      </w:r>
-      <w:proofErr w:type="spellEnd"/>
-      <w:r>
-        <w:rPr>
-          <w:rFonts w:ascii="Courier New" w:hAnsi="Courier New"/>
-          <w:sz w:val="18"/>
-        </w:rPr>
-        <w:t xml:space="preserve"> + SERVICE_LEVEL_Z * </w:t>
-      </w:r>
-      <w:proofErr w:type="spellStart"/>
-      <w:proofErr w:type="gramStart"/>
-      <w:r>
-        <w:rPr>
-          <w:rFonts w:ascii="Courier New" w:hAnsi="Courier New"/>
-          <w:sz w:val="18"/>
-        </w:rPr>
-        <w:t>np.sqrt</w:t>
-      </w:r>
-      <w:proofErr w:type="spellEnd"/>
-      <w:proofErr w:type="gramEnd"/>
-      <w:r>
-        <w:rPr>
-          <w:rFonts w:ascii="Courier New" w:hAnsi="Courier New"/>
-          <w:sz w:val="18"/>
-        </w:rPr>
-        <w:t>(var)</w:t>
-      </w:r>
-    </w:p>
-    <w:p>
-      <w:pPr>
-        <w:spacing w:after="0"/>
-        <w:ind w:left="432"/>
-      </w:pPr>
-      <w:r>
-        <w:rPr>
-          <w:rFonts w:ascii="Courier New" w:hAnsi="Courier New"/>
-          <w:sz w:val="18"/>
-        </w:rPr>
-        <w:t xml:space="preserve">q     = </w:t>
-      </w:r>
-      <w:proofErr w:type="spellStart"/>
-      <w:proofErr w:type="gramStart"/>
-      <w:r>
-        <w:rPr>
-          <w:rFonts w:ascii="Courier New" w:hAnsi="Courier New"/>
-          <w:sz w:val="18"/>
-        </w:rPr>
-        <w:t>np.maximum</w:t>
-      </w:r>
-      <w:proofErr w:type="spellEnd"/>
-      <w:proofErr w:type="gramEnd"/>
-      <w:r>
-        <w:rPr>
-          <w:rFonts w:ascii="Courier New" w:hAnsi="Courier New"/>
-          <w:sz w:val="18"/>
-        </w:rPr>
-        <w:t xml:space="preserve">(0, S - </w:t>
-      </w:r>
-      <w:proofErr w:type="spellStart"/>
-      <w:r>
-        <w:rPr>
-          <w:rFonts w:ascii="Courier New" w:hAnsi="Courier New"/>
-          <w:sz w:val="18"/>
-        </w:rPr>
-        <w:t>on_hand</w:t>
-      </w:r>
-      <w:proofErr w:type="spellEnd"/>
-      <w:r>
-        <w:rPr>
-          <w:rFonts w:ascii="Courier New" w:hAnsi="Courier New"/>
-          <w:sz w:val="18"/>
-        </w:rPr>
-        <w:t xml:space="preserve"> - </w:t>
-      </w:r>
-      <w:proofErr w:type="gramStart"/>
-      <w:r>
-        <w:rPr>
-          <w:rFonts w:ascii="Courier New" w:hAnsi="Courier New"/>
-          <w:sz w:val="18"/>
-        </w:rPr>
-        <w:t xml:space="preserve">pending)   </w:t>
-      </w:r>
-      <w:proofErr w:type="gramEnd"/>
-      <w:r>
-        <w:rPr>
-          <w:rFonts w:ascii="Courier New" w:hAnsi="Courier New"/>
-          <w:sz w:val="18"/>
-        </w:rPr>
-        <w:t># order quantity</w:t>
+        <w:t>q     = np.maximum(0, S - on_hand - pending)   # order quantity</w:t>
       </w:r>
     </w:p>
     <w:p>
@@ -29304,35 +27088,7 @@
         <w:rPr>
           <w:color w:val="auto"/>
         </w:rPr>
-        <w:t xml:space="preserve">SHAP </w:t>
-      </w:r>
-      <w:proofErr w:type="spellStart"/>
-      <w:r>
-        <w:rPr>
-          <w:color w:val="auto"/>
-        </w:rPr>
-        <w:t>beeswarm</w:t>
-      </w:r>
-      <w:proofErr w:type="spellEnd"/>
-      <w:r>
-        <w:rPr>
-          <w:color w:val="auto"/>
-        </w:rPr>
-        <w:t xml:space="preserve"> of the demand model: </w:t>
-      </w:r>
-      <w:proofErr w:type="spellStart"/>
-      <w:r>
-        <w:rPr>
-          <w:color w:val="auto"/>
-        </w:rPr>
-        <w:t>colour</w:t>
-      </w:r>
-      <w:proofErr w:type="spellEnd"/>
-      <w:r>
-        <w:rPr>
-          <w:color w:val="auto"/>
-        </w:rPr>
-        <w:t xml:space="preserve"> = feature value, position = push on the forecast.</w:t>
+        <w:t>SHAP beeswarm of the demand model: colour = feature value, position = push on the forecast.</w:t>
       </w:r>
       <w:bookmarkEnd w:id="92"/>
     </w:p>
@@ -29663,15 +27419,7 @@
         <w:t>Reproducibility.</w:t>
       </w:r>
       <w:r>
-        <w:t xml:space="preserve"> Fixed seed 42; all settings in </w:t>
-      </w:r>
-      <w:proofErr w:type="spellStart"/>
-      <w:r>
-        <w:t>src</w:t>
-      </w:r>
-      <w:proofErr w:type="spellEnd"/>
-      <w:r>
-        <w:t>/config.py; the Rossmann data is downloadable from Kaggle; python src/run_all.py regenerates every number and figure in this report.</w:t>
+        <w:t xml:space="preserve"> Fixed seed 42; all settings in src/config.py; the Rossmann data is downloadable from Kaggle; python src/run_all.py regenerates every number and figure in this report.</w:t>
       </w:r>
     </w:p>
     <w:p>
@@ -29735,21 +27483,12 @@
       <w:pStyle w:val="Footer"/>
       <w:jc w:val="center"/>
     </w:pPr>
-    <w:proofErr w:type="spellStart"/>
     <w:r>
       <w:rPr>
         <w:color w:val="555555"/>
         <w:sz w:val="18"/>
       </w:rPr>
-      <w:t>DemandIQ</w:t>
-    </w:r>
-    <w:proofErr w:type="spellEnd"/>
-    <w:r>
-      <w:rPr>
-        <w:color w:val="555555"/>
-        <w:sz w:val="18"/>
-      </w:rPr>
-      <w:t xml:space="preserve">   |   Page </w:t>
+      <w:t xml:space="preserve">DemandIQ   |   Page </w:t>
     </w:r>
     <w:r>
       <w:rPr>
@@ -29792,21 +27531,12 @@
       <w:pStyle w:val="Footer"/>
       <w:jc w:val="center"/>
     </w:pPr>
-    <w:proofErr w:type="spellStart"/>
     <w:r>
       <w:rPr>
         <w:color w:val="555555"/>
         <w:sz w:val="18"/>
       </w:rPr>
-      <w:t>DemandIQ</w:t>
-    </w:r>
-    <w:proofErr w:type="spellEnd"/>
-    <w:r>
-      <w:rPr>
-        <w:color w:val="555555"/>
-        <w:sz w:val="18"/>
-      </w:rPr>
-      <w:t xml:space="preserve">   |   Page </w:t>
+      <w:t xml:space="preserve">DemandIQ   |   Page </w:t>
     </w:r>
     <w:r>
       <w:rPr>
@@ -29877,23 +27607,13 @@
       </w:pBdr>
       <w:jc w:val="right"/>
     </w:pPr>
-    <w:proofErr w:type="spellStart"/>
     <w:r>
       <w:rPr>
         <w:i/>
         <w:color w:val="555555"/>
         <w:sz w:val="18"/>
       </w:rPr>
-      <w:t>DemandIQ</w:t>
-    </w:r>
-    <w:proofErr w:type="spellEnd"/>
-    <w:r>
-      <w:rPr>
-        <w:i/>
-        <w:color w:val="555555"/>
-        <w:sz w:val="18"/>
-      </w:rPr>
-      <w:t xml:space="preserve"> - Machine Learning Group Activity Report</w:t>
+      <w:t>DemandIQ - Machine Learning Group Activity Report</w:t>
     </w:r>
   </w:p>
 </w:hdr>
@@ -29909,23 +27629,13 @@
       </w:pBdr>
       <w:jc w:val="right"/>
     </w:pPr>
-    <w:proofErr w:type="spellStart"/>
     <w:r>
       <w:rPr>
         <w:i/>
         <w:color w:val="555555"/>
         <w:sz w:val="18"/>
       </w:rPr>
-      <w:t>DemandIQ</w:t>
-    </w:r>
-    <w:proofErr w:type="spellEnd"/>
-    <w:r>
-      <w:rPr>
-        <w:i/>
-        <w:color w:val="555555"/>
-        <w:sz w:val="18"/>
-      </w:rPr>
-      <w:t xml:space="preserve"> - Machine Learning Group Activity Report</w:t>
+      <w:t>DemandIQ - Machine Learning Group Activity Report</w:t>
     </w:r>
   </w:p>
 </w:hdr>

</xml_diff>